<commit_message>
fix(thesis): clarify Ch2 P8/SIDS mapping-table label (7 Pacific main, 9-econ robustness)
- Ch2 §2.5 mapping table row was 'P8 — SIDS (9 nền kinh tế)', which
  attributed the 9-economy SIDS regime to P8 whose main analysis is the
  7 Pacific SIDS (N=959); relabelled to state both scopes explicitly,
  matching Ch3 and the P8 manuscript. Synced thesis/ + dist source_md +
  regenerated docx. No data values changed.
- Updated THESIS_CHUYENDE_DATA_INTEGRITY note: B2 resolved; added
  section E confirming all five 2026-06-07 MAJOR issues (M1-M5) are now
  addressed (front matter complete, conceptual-model figure present,
  references consolidated, hypothesis codes defined); remaining items
  are the author-decision data reconciliations (49-vs-52, CD1 numbers).
</commit_message>
<xml_diff>
--- a/dist/luan_an_ctu/chuong_2_tong_quan_tai_lieu_vi.docx
+++ b/dist/luan_an_ctu/chuong_2_tong_quan_tai_lieu_vi.docx
@@ -26,7 +26,7 @@
         </w:pict>
       </w:r>
     </w:p>
-    <w:bookmarkStart w:id="24" w:name="Xeb842970bc83042d8d18acf50fede2fc1910f98"/>
+    <w:bookmarkStart w:id="24" w:name="các-khái-niệm-cốt-lõi"/>
     <w:p>
       <w:pPr>
         <w:pStyle w:val="Heading2"/>
@@ -35,7 +35,7 @@
         <w:t xml:space="preserve">2.1 Các khái niệm cốt lõi</w:t>
       </w:r>
     </w:p>
-    <w:bookmarkStart w:id="20" w:name="X95197dc4b90af853c087270af074cb545b6a612"/>
+    <w:bookmarkStart w:id="20" w:name="quốc-tế-hóa-doanh-nghiệp"/>
     <w:p>
       <w:pPr>
         <w:pStyle w:val="Heading3"/>
@@ -49,7 +49,25 @@
         <w:pStyle w:val="FirstParagraph"/>
       </w:pPr>
       <w:r>
-        <w:t xml:space="preserve">Quốc tế hóa doanh nghiệp (internationalization) được hiểu là mức độ và phạm vi tham gia của một doanh nghiệp vào các hoạt động kinh tế có yếu tố quốc tế, bao gồm xuất khẩu hàng hóa và dịch vụ, đầu tư trực tiếp ra nước ngoài, liên doanh quốc tế, cấp phép công nghệ xuyên biên giới, và thiết lập mạng lưới phân phối ở thị trường nước ngoài (Sullivan, 1994; Hitt et al., 2006). Khái niệm này không đồng nhất với "toàn cầu hóa" — vốn mang nghĩa một xu hướng kinh tế vĩ mô — mà là một thuộc tính đo lường được ở cấp độ doanh nghiệp, phản ánh chiến lược mở rộng quốc tế và mức độ phụ thuộc vào thị trường nước ngoài.</w:t>
+        <w:t xml:space="preserve">Quốc tế hóa doanh nghiệp (internationalization) được hiểu là mức độ và phạm vi tham gia của một doanh nghiệp vào các hoạt động kinh tế có yếu tố quốc tế, bao gồm xuất khẩu hàng hóa và dịch vụ, đầu tư trực tiếp ra nước ngoài, liên doanh quốc tế, cấp phép công nghệ xuyên biên giới, và thiết lập mạng lưới phân phối ở thị trường nước ngoài (Sullivan, 1994; Hitt et al., 2006). Khái niệm này không đồng nhất với</w:t>
+      </w:r>
+      <w:r>
+        <w:t xml:space="preserve"> </w:t>
+      </w:r>
+      <w:r>
+        <w:t xml:space="preserve">“</w:t>
+      </w:r>
+      <w:r>
+        <w:t xml:space="preserve">toàn cầu hóa</w:t>
+      </w:r>
+      <w:r>
+        <w:t xml:space="preserve">”</w:t>
+      </w:r>
+      <w:r>
+        <w:t xml:space="preserve"> </w:t>
+      </w:r>
+      <w:r>
+        <w:t xml:space="preserve">— vốn mang nghĩa một xu hướng kinh tế vĩ mô — mà là một thuộc tính đo lường được ở cấp độ doanh nghiệp, phản ánh chiến lược mở rộng quốc tế và mức độ phụ thuộc vào thị trường nước ngoài.</w:t>
       </w:r>
     </w:p>
     <w:p>
@@ -69,7 +87,7 @@
       </w:r>
     </w:p>
     <w:bookmarkEnd w:id="20"/>
-    <w:bookmarkStart w:id="21" w:name="X23320108b4df79c6460d3f872858ea0cbd6d69f"/>
+    <w:bookmarkStart w:id="21" w:name="hiệu-quả-hoạt-động-doanh-nghiệp"/>
     <w:p>
       <w:pPr>
         <w:pStyle w:val="Heading3"/>
@@ -83,7 +101,7 @@
         <w:pStyle w:val="FirstParagraph"/>
       </w:pPr>
       <w:r>
-        <w:t xml:space="preserve">Hiệu quả hoạt động doanh nghiệp (firm performance) là một khái niệm đa chiều không có một định nghĩa hoặc thước đo thống nhất trong literature. Combs et al. (2005) và Richard et al. (2009) phân biệt ba nhóm thước đo chính: (i) thước đo dựa trên kế toán (accounting-based), bao gồm tỷ suất sinh lời trên tổng tài sản (ROA), tỷ suất sinh lời trên vốn chủ sở hữu (ROE), và tỷ suất sinh lời trên doanh thu (ROS); (ii) thước đo dựa trên thị trường tài chính (market-based), bao gồm Tobin's Q và tổng lợi nhuận cổ đông; và (iii) thước đo dựa trên năng suất và tăng trưởng (productivity-based), bao gồm năng suất lao động (labor productivity) và tăng trưởng doanh thu.</w:t>
+        <w:t xml:space="preserve">Hiệu quả hoạt động doanh nghiệp (firm performance) là một khái niệm đa chiều không có một định nghĩa hoặc thước đo thống nhất trong literature. Combs et al. (2005) và Richard et al. (2009) phân biệt ba nhóm thước đo chính: (i) thước đo dựa trên kế toán (accounting-based), bao gồm tỷ suất sinh lời trên tổng tài sản (ROA), tỷ suất sinh lời trên vốn chủ sở hữu (ROE), và tỷ suất sinh lời trên doanh thu (ROS); (ii) thước đo dựa trên thị trường tài chính (market-based), bao gồm Tobin’s Q và tổng lợi nhuận cổ đông; và (iii) thước đo dựa trên năng suất và tăng trưởng (productivity-based), bao gồm năng suất lao động (labor productivity) và tăng trưởng doanh thu.</w:t>
       </w:r>
     </w:p>
     <w:p>
@@ -103,7 +121,7 @@
       </w:r>
     </w:p>
     <w:bookmarkEnd w:id="21"/>
-    <w:bookmarkStart w:id="22" w:name="X9c6b6eef2b3fa90aa8196d44cbc49a384fa7d7f"/>
+    <w:bookmarkStart w:id="22" w:name="Xfff4943f729a78f5449986a54b8a0ad8ed2eb31"/>
     <w:p>
       <w:pPr>
         <w:pStyle w:val="Heading3"/>
@@ -117,7 +135,25 @@
         <w:pStyle w:val="FirstParagraph"/>
       </w:pPr>
       <w:r>
-        <w:t xml:space="preserve">Một trong những đóng góp khái niệm trọng tâm của luận án là sự phân biệt rõ ràng giữa hai construct: năng lực công nghệ (Technological Capability Index — TCI) và chỉ số chấp nhận số (Digital Adoption Index — DAI). Trong nhiều nghiên cứu trước đây, hai construct này thường bị gộp lại thành một khái niệm chung về "năng lực số" (digital capability), dẫn đến sự mơ hồ lý thuyết và sai lệch trong đo lường (Bhandari et al., 2023; Bustamante et al., 2022).</w:t>
+        <w:t xml:space="preserve">Một trong những đóng góp khái niệm trọng tâm của luận án là sự phân biệt rõ ràng giữa hai construct: năng lực công nghệ (Technological Capability Index — TCI) và chỉ số chấp nhận số (Digital Adoption Index — DAI). Trong nhiều nghiên cứu trước đây, hai construct này thường bị gộp lại thành một khái niệm chung về</w:t>
+      </w:r>
+      <w:r>
+        <w:t xml:space="preserve"> </w:t>
+      </w:r>
+      <w:r>
+        <w:t xml:space="preserve">“</w:t>
+      </w:r>
+      <w:r>
+        <w:t xml:space="preserve">năng lực số</w:t>
+      </w:r>
+      <w:r>
+        <w:t xml:space="preserve">”</w:t>
+      </w:r>
+      <w:r>
+        <w:t xml:space="preserve"> </w:t>
+      </w:r>
+      <w:r>
+        <w:t xml:space="preserve">(digital capability), dẫn đến sự mơ hồ lý thuyết và sai lệch trong đo lường (Bhandari et al., 2023; Bustamante et al., 2022).</w:t>
       </w:r>
     </w:p>
     <w:p>
@@ -133,19 +169,37 @@
         <w:pStyle w:val="BodyText"/>
       </w:pPr>
       <w:r>
-        <w:t xml:space="preserve">Chỉ số chấp nhận số (Digital Adoption Index — DAI), ngược lại, phản ánh mức độ áp dụng các công cụ số tại giao diện ngoại tại của doanh nghiệp — bao gồm việc sở hữu website, sử dụng email trong giao dịch kinh doanh, thanh toán điện tử, và bán hàng trực tuyến. Đây là các công cụ số có tính bề mặt (surface digital tools) theo phân loại của Verhoef et al. (2021), tức là nằm ở cấp độ số hóa (digitization) và số hóa quy trình (digitalization), chưa đạt đến cấp độ chuyển đổi số toàn diện (digital transformation). Trong phạm vi luận án, DAI được đo bằng proxy "foundational website adoption" từ dữ liệu WBES — đây là ràng buộc đo lường có chủ đích do giới hạn của bộ dữ liệu, không phải thiếu sót lý thuyết.</w:t>
-      </w:r>
-    </w:p>
-    <w:p>
-      <w:pPr>
-        <w:pStyle w:val="BodyText"/>
-      </w:pPr>
-      <w:r>
-        <w:t xml:space="preserve">Hai construct TCI và DAI không đồng nhất và vận hành theo cơ chế khác nhau trong mối quan hệ quốc tế hóa — hiệu quả: TCI hoạt động chủ yếu như một nhân tố nâng mặt bằng hiệu quả (level shifter), trong khi DAI có xu hướng làm thay đổi độ dốc hoặc độ cong của đường quan hệ I–P tùy theo bối cảnh (Bhandari et al., 2023; Chen &amp; Meng, 2022). Việc duy trì sự phân biệt rõ ràng này trong suốt luận án là điều kiện tiên quyết để đảm bảo tính thuần khiết của cấu trúc (construct purity) theo tiêu chuẩn của Coltman et al. (2008).</w:t>
+        <w:t xml:space="preserve">Chỉ số chấp nhận số (Digital Adoption Index — DAI), ngược lại, phản ánh mức độ áp dụng các công cụ số tại giao diện ngoại tại của doanh nghiệp — bao gồm việc sở hữu website, sử dụng email trong giao dịch kinh doanh, thanh toán điện tử, và bán hàng trực tuyến. Đây là các công cụ số có tính bề mặt (surface digital tools) theo phân loại của Verhoef et al. (2021), tức là nằm ở cấp độ số hóa (digitization) và số hóa quy trình (digitalization), chưa đạt đến cấp độ chuyển đổi số toàn diện (digital transformation). Trong phạm vi luận án, DAI được đo bằng proxy</w:t>
+      </w:r>
+      <w:r>
+        <w:t xml:space="preserve"> </w:t>
+      </w:r>
+      <w:r>
+        <w:t xml:space="preserve">“</w:t>
+      </w:r>
+      <w:r>
+        <w:t xml:space="preserve">foundational website adoption</w:t>
+      </w:r>
+      <w:r>
+        <w:t xml:space="preserve">”</w:t>
+      </w:r>
+      <w:r>
+        <w:t xml:space="preserve"> </w:t>
+      </w:r>
+      <w:r>
+        <w:t xml:space="preserve">từ dữ liệu WBES — đây là ràng buộc đo lường có chủ đích do giới hạn của bộ dữ liệu, không phải thiếu sót lý thuyết.</w:t>
+      </w:r>
+    </w:p>
+    <w:p>
+      <w:pPr>
+        <w:pStyle w:val="BodyText"/>
+      </w:pPr>
+      <w:r>
+        <w:t xml:space="preserve">Hai construct TCI và DAI không đồng nhất và vận hành theo cơ chế khác nhau trong mối quan hệ quốc tế hóa — hiệu quả: TCI hoạt động chủ yếu như một nhân tố nâng mặt bằng hiệu quả (level shifter), trong khi DAI có xu hướng làm thay đổi độ dốc hoặc độ cong của đường quan hệ I–P tùy theo bối cảnh (Bhandari et al., 2023; Chen &amp; Meng, 2022). Việc duy trì sự phân biệt rõ ràng này trong suốt luận án là điều kiện tiên quyết để đảm bảo tính thuần khiết của cấu trúc (construct purity) theo tiêu chuẩn của Coltman et al. (2008).</w:t>
       </w:r>
     </w:p>
     <w:bookmarkEnd w:id="22"/>
-    <w:bookmarkStart w:id="23" w:name="X6bd70045f4aae0cc6208f3a45673fcdcfb9dd8a"/>
+    <w:bookmarkStart w:id="23" w:name="bối-cảnh-thể-chế-và-khung-icrv"/>
     <w:p>
       <w:pPr>
         <w:pStyle w:val="Heading3"/>
@@ -159,15 +213,33 @@
         <w:pStyle w:val="FirstParagraph"/>
       </w:pPr>
       <w:r>
-        <w:t xml:space="preserve">Thể chế (institutions) theo North (1990) là "luật chơi" của một xã hội, bao gồm các ràng buộc chính thức (luật pháp, quy định, hợp đồng) và phi chính thức (chuẩn mực, giá trị, văn hóa ứng xử). Thể chế tạo ra cấu trúc khuyến khích và chi phí giao dịch, do đó ảnh hưởng trực tiếp đến chiến lược và kết quả kinh doanh của doanh nghiệp.</w:t>
-      </w:r>
-    </w:p>
-    <w:p>
-      <w:pPr>
-        <w:pStyle w:val="BodyText"/>
-      </w:pPr>
-      <w:r>
-        <w:t xml:space="preserve">Để vận hành hóa bối cảnh thể chế đa cấp và đa quốc gia trong luận án, khung ICRV (Institutional Context Regime Variation — Biến thiên chế độ bối cảnh thể chế) được phát triển như một công cụ phân loại có hệ thống. Khung ICRV chia 49 nền kinh tế trong phạm vi nghiên cứu thành sáu nhóm (sub-regime), dựa trên tổ hợp các chỉ số quản trị toàn cầu (World Governance Indicators — WGI) của Kaufmann et al. (2011), mức độ phát triển kinh tế, và đặc trưng cấu trúc thể chế: Nhóm I (Advanced Innovation-Driven, bao gồm Singapore, Hong Kong, Đài Loan, Hàn Quốc), Nhóm II (Advanced Resource-Driven, bao gồm các nền kinh tế vùng Vịnh), Nhóm III (Upper-middle, điển hình là Trung Quốc), Nhóm IV (Lower-middle transition, bao gồm Việt Nam và Ấn Độ), Nhóm V (Frontier), và Nhóm VI (SIDS — Small Island Developing States). Khung này mở rộng từ phân loại thể chế của Khanna và Palepu (2010) và được điều chỉnh để phản ánh thực tiễn đa dạng của châu Á và khu vực lân cận.</w:t>
+        <w:t xml:space="preserve">Thể chế (institutions) theo North (1990) là</w:t>
+      </w:r>
+      <w:r>
+        <w:t xml:space="preserve"> </w:t>
+      </w:r>
+      <w:r>
+        <w:t xml:space="preserve">“</w:t>
+      </w:r>
+      <w:r>
+        <w:t xml:space="preserve">luật chơi</w:t>
+      </w:r>
+      <w:r>
+        <w:t xml:space="preserve">”</w:t>
+      </w:r>
+      <w:r>
+        <w:t xml:space="preserve"> </w:t>
+      </w:r>
+      <w:r>
+        <w:t xml:space="preserve">của một xã hội, bao gồm các ràng buộc chính thức (luật pháp, quy định, hợp đồng) và phi chính thức (chuẩn mực, giá trị, văn hóa ứng xử). Thể chế tạo ra cấu trúc khuyến khích và chi phí giao dịch, do đó ảnh hưởng trực tiếp đến chiến lược và kết quả kinh doanh của doanh nghiệp.</w:t>
+      </w:r>
+    </w:p>
+    <w:p>
+      <w:pPr>
+        <w:pStyle w:val="BodyText"/>
+      </w:pPr>
+      <w:r>
+        <w:t xml:space="preserve">Để vận hành hóa bối cảnh thể chế đa cấp và đa quốc gia trong luận án, khung ICRV (Institutional Context Regime Variation — Biến thiên chế độ bối cảnh thể chế) được phát triển như một công cụ phân loại có hệ thống. Khung ICRV chia 49 nền kinh tế trong phạm vi nghiên cứu thành sáu nhóm (sub-regime), dựa trên tổ hợp các chỉ số quản trị toàn cầu (World Governance Indicators — WGI) của Kaufmann et al. (2011), mức độ phát triển kinh tế, và đặc trưng cấu trúc thể chế: Nhóm I (Advanced Innovation-Driven, bao gồm Singapore, Hong Kong, Đài Loan, Hàn Quốc), Nhóm II (Advanced Resource-Driven, bao gồm các nền kinh tế vùng Vịnh), Nhóm III (Upper-middle, điển hình là Trung Quốc), Nhóm IV (Lower-middle transition, bao gồm Việt Nam và Ấn Độ), Nhóm V (Frontier), và Nhóm VI (SIDS — Small Island Developing States). Khung này mở rộng từ phân loại thể chế của Khanna và Palepu (2010) và được điều chỉnh để phản ánh thực tiễn đa dạng của châu Á và khu vực lân cận.</w:t>
       </w:r>
     </w:p>
     <w:p>
@@ -187,7 +259,7 @@
     </w:p>
     <w:bookmarkEnd w:id="23"/>
     <w:bookmarkEnd w:id="24"/>
-    <w:bookmarkStart w:id="30" w:name="Xd1f28dbba0aaaf84fdd94ae0c3fe8487075de6a"/>
+    <w:bookmarkStart w:id="30" w:name="các-lý-thuyết-nền"/>
     <w:p>
       <w:pPr>
         <w:pStyle w:val="Heading2"/>
@@ -196,7 +268,7 @@
         <w:t xml:space="preserve">2.2 Các lý thuyết nền</w:t>
       </w:r>
     </w:p>
-    <w:bookmarkStart w:id="25" w:name="X123f2d0cccf9e047426163a78ac712a37336f74"/>
+    <w:bookmarkStart w:id="25" w:name="mô-hình-quốc-tế-hóa-uppsala"/>
     <w:p>
       <w:pPr>
         <w:pStyle w:val="Heading3"/>
@@ -218,19 +290,73 @@
         <w:pStyle w:val="BodyText"/>
       </w:pPr>
       <w:r>
-        <w:t xml:space="preserve">Một trong những khái niệm trọng tâm của mô hình Uppsala là "gánh nặng của người nước ngoài" (liability of foreignness) — chi phí và bất lợi mà doanh nghiệp phải gánh chịu khi hoạt động ở môi trường văn hóa, thể chế, và pháp lý xa lạ (Zaheer, 1995). Johanson và Vahlne (2009) cập nhật mô hình bằng cách bổ sung khái niệm "gánh nặng của người ngoài mạng lưới" (liability of outsidership), nhấn mạnh rằng trong nền kinh tế toàn cầu hiện đại, rào cản lớn nhất không phải là khoảng cách địa lý hay tâm lý, mà là vị trí ngoài lề của các mạng lưới kinh doanh địa phương. Hai loại gánh nặng này giải thích vì sao chi phí quốc tế hóa giai đoạn đầu thường cao, tạo ra giai đoạn hiệu quả giảm trước khi doanh nghiệp tích lũy đủ tri thức và quan hệ để thu được lợi ích từ mở rộng quốc tế (Lu &amp; Beamish, 2004; Contractor et al., 2003).</w:t>
-      </w:r>
-    </w:p>
-    <w:p>
-      <w:pPr>
-        <w:pStyle w:val="BodyText"/>
-      </w:pPr>
-      <w:r>
-        <w:t xml:space="preserve">Tuy nhiên, mô hình Uppsala cổ điển được xây dựng trong bối cảnh tiền số và tiền nền tảng (pre-platform), nên đã bị thách thức đáng kể trong thập kỷ gần đây. Các nghiên cứu về born-global firms — tức doanh nghiệp quốc tế hóa ngay từ giai đoạn đầu mà không theo trình tự tuần tự — và platform firms — tức doanh nghiệp công nghệ tận dụng nền tảng số để vươn ra thị trường quốc tế không cần hiện diện vật lý — cho thấy logic của Uppsala không còn phổ quát (Stallkamp &amp; Schotter, 2021; Yang et al., 2025). Trong luận án này, mô hình Uppsala không bị bác bỏ, mà được tái định vị như một lớp nền giải thích chi phí học hỏi và bất định trong giai đoạn đầu quốc tế hóa, còn cơ chế học hỏi được mở rộng để bao gồm "học hỏi tăng cường bằng dữ liệu số" (data-augmented learning) trong kỷ nguyên chuyển đổi số, nơi dữ liệu từ thị trường nước ngoài có thể được thu thập, xử lý và phân tích nhanh hơn nhiều so với trước (Banalieva &amp; Dhanaraj, 2019).</w:t>
+        <w:t xml:space="preserve">Một trong những khái niệm trọng tâm của mô hình Uppsala là</w:t>
+      </w:r>
+      <w:r>
+        <w:t xml:space="preserve"> </w:t>
+      </w:r>
+      <w:r>
+        <w:t xml:space="preserve">“</w:t>
+      </w:r>
+      <w:r>
+        <w:t xml:space="preserve">gánh nặng của người nước ngoài</w:t>
+      </w:r>
+      <w:r>
+        <w:t xml:space="preserve">”</w:t>
+      </w:r>
+      <w:r>
+        <w:t xml:space="preserve"> </w:t>
+      </w:r>
+      <w:r>
+        <w:t xml:space="preserve">(liability of foreignness) — chi phí và bất lợi mà doanh nghiệp phải gánh chịu khi hoạt động ở môi trường văn hóa, thể chế, và pháp lý xa lạ (Zaheer, 1995). Johanson và Vahlne (2009) cập nhật mô hình bằng cách bổ sung khái niệm</w:t>
+      </w:r>
+      <w:r>
+        <w:t xml:space="preserve"> </w:t>
+      </w:r>
+      <w:r>
+        <w:t xml:space="preserve">“</w:t>
+      </w:r>
+      <w:r>
+        <w:t xml:space="preserve">gánh nặng của người ngoài mạng lưới</w:t>
+      </w:r>
+      <w:r>
+        <w:t xml:space="preserve">”</w:t>
+      </w:r>
+      <w:r>
+        <w:t xml:space="preserve"> </w:t>
+      </w:r>
+      <w:r>
+        <w:t xml:space="preserve">(liability of outsidership), nhấn mạnh rằng trong nền kinh tế toàn cầu hiện đại, rào cản lớn nhất không phải là khoảng cách địa lý hay tâm lý, mà là vị trí ngoài lề của các mạng lưới kinh doanh địa phương. Hai loại gánh nặng này giải thích vì sao chi phí quốc tế hóa giai đoạn đầu thường cao, tạo ra giai đoạn hiệu quả giảm trước khi doanh nghiệp tích lũy đủ tri thức và quan hệ để thu được lợi ích từ mở rộng quốc tế (Lu &amp; Beamish, 2004; Contractor et al., 2003).</w:t>
+      </w:r>
+    </w:p>
+    <w:p>
+      <w:pPr>
+        <w:pStyle w:val="BodyText"/>
+      </w:pPr>
+      <w:r>
+        <w:t xml:space="preserve">Tuy nhiên, mô hình Uppsala cổ điển được xây dựng trong bối cảnh tiền số và tiền nền tảng (pre-platform), nên đã bị thách thức đáng kể trong thập kỷ gần đây. Các nghiên cứu về born-global firms — tức doanh nghiệp quốc tế hóa ngay từ giai đoạn đầu mà không theo trình tự tuần tự — và platform firms — tức doanh nghiệp công nghệ tận dụng nền tảng số để vươn ra thị trường quốc tế không cần hiện diện vật lý — cho thấy logic của Uppsala không còn phổ quát (Stallkamp &amp; Schotter, 2021; Yang et al., 2025). Trong luận án này, mô hình Uppsala không bị bác bỏ, mà được tái định vị như một lớp nền giải thích chi phí học hỏi và bất định trong giai đoạn đầu quốc tế hóa, còn cơ chế học hỏi được mở rộng để bao gồm</w:t>
+      </w:r>
+      <w:r>
+        <w:t xml:space="preserve"> </w:t>
+      </w:r>
+      <w:r>
+        <w:t xml:space="preserve">“</w:t>
+      </w:r>
+      <w:r>
+        <w:t xml:space="preserve">học hỏi tăng cường bằng dữ liệu số</w:t>
+      </w:r>
+      <w:r>
+        <w:t xml:space="preserve">”</w:t>
+      </w:r>
+      <w:r>
+        <w:t xml:space="preserve"> </w:t>
+      </w:r>
+      <w:r>
+        <w:t xml:space="preserve">(data-augmented learning) trong kỷ nguyên chuyển đổi số, nơi dữ liệu từ thị trường nước ngoài có thể được thu thập, xử lý và phân tích nhanh hơn nhiều so với trước (Banalieva &amp; Dhanaraj, 2019).</w:t>
       </w:r>
     </w:p>
     <w:bookmarkEnd w:id="25"/>
-    <w:bookmarkStart w:id="26" w:name="Xd46e050d683b59cb485bc3079e0c0f791ad8652"/>
+    <w:bookmarkStart w:id="26" w:name="lý-thuyết-dựa-trên-nguồn-lực"/>
     <w:p>
       <w:pPr>
         <w:pStyle w:val="Heading3"/>
@@ -260,11 +386,11 @@
         <w:pStyle w:val="BodyText"/>
       </w:pPr>
       <w:r>
-        <w:t xml:space="preserve">Trong bối cảnh đương đại, RBV được mở rộng bằng lý thuyết năng lực động (dynamic capabilities) của Teece et al. (1997), nhấn mạnh khả năng của doanh nghiệp trong việc tích hợp, xây dựng và tái cấu hình các năng lực nội bộ để ứng phó với môi trường cạnh tranh thay đổi nhanh chóng. Trong kỷ nguyên số, năng lực công nghệ (TCI) — theo phân biệt của luận án — được xem là một dạng năng lực động quan trọng, cho phép doanh nghiệp tái cấu hình nguồn lực và mô hình kinh doanh để ứng phó với bất định trong quốc tế hóa (Bhandari et al., 2023; Verhoef et al., 2021). DAI — chỉ số áp dụng số nền tảng (Tier-1 proxy) đo lường sự hiện diện website — phản ánh mức độ chấp nhận kỹ thuật số cơ bản chứ không phải năng lực động theo nghĩa Teece et al. (1997). RBV cung cấp nền lý thuyết trực tiếp cho giả thuyết H2 về vai trò điều tiết của TCI, trong khi H3 về DAI được neo đậu trong Foundational Digital Adoption Framework (Banalieva &amp; Dhanaraj, 2019).</w:t>
+        <w:t xml:space="preserve">Trong bối cảnh đương đại, RBV được mở rộng bằng lý thuyết năng lực động (dynamic capabilities) của Teece et al. (1997), nhấn mạnh khả năng của doanh nghiệp trong việc tích hợp, xây dựng và tái cấu hình các năng lực nội bộ để ứng phó với môi trường cạnh tranh thay đổi nhanh chóng. Trong kỷ nguyên số, năng lực công nghệ (TCI) — theo phân biệt của luận án — được xem là một dạng năng lực động quan trọng, cho phép doanh nghiệp tái cấu hình nguồn lực và mô hình kinh doanh để ứng phó với bất định trong quốc tế hóa (Bhandari et al., 2023; Verhoef et al., 2021). DAI — chỉ số áp dụng số nền tảng (Tier-1 proxy) đo lường sự hiện diện website — phản ánh mức độ chấp nhận kỹ thuật số cơ bản chứ không phải năng lực động theo nghĩa Teece et al. (1997). RBV cung cấp nền lý thuyết trực tiếp cho giả thuyết H2 về vai trò điều tiết của TCI, trong khi H3 về DAI được neo đậu trong Foundational Digital Adoption Framework (Banalieva &amp; Dhanaraj, 2019).</w:t>
       </w:r>
     </w:p>
     <w:bookmarkEnd w:id="26"/>
-    <w:bookmarkStart w:id="27" w:name="X8df923fa541d02623fafefda8e8dfdd0f8f8811"/>
+    <w:bookmarkStart w:id="27" w:name="lý-thuyết-thể-chế"/>
     <w:p>
       <w:pPr>
         <w:pStyle w:val="Heading3"/>
@@ -286,19 +412,37 @@
         <w:pStyle w:val="BodyText"/>
       </w:pPr>
       <w:r>
-        <w:t xml:space="preserve">North (1990) chỉ ra rằng thể chế hiệu quả làm giảm chi phí giao dịch, bảo vệ quyền sở hữu trí tuệ, và tạo ra môi trường khuyến khích đầu tư dài hạn. Ngược lại, ở các nền kinh tế đang phát triển, sự vắng mặt hoặc yếu kém của các thể chế trung gian thị trường — từ hệ thống pháp lý đến thị trường vốn, từ tổ chức đánh giá tín nhiệm đến hiệp hội ngành nghề — tạo ra "khoảng trống thể chế" (institutional voids) làm tăng chi phí giao dịch và rủi ro cho doanh nghiệp khi hoạt động hoặc mở rộng ra nước ngoài (Khanna &amp; Palepu, 2010).</w:t>
-      </w:r>
-    </w:p>
-    <w:p>
-      <w:pPr>
-        <w:pStyle w:val="BodyText"/>
-      </w:pPr>
-      <w:r>
-        <w:t xml:space="preserve">Trong literature về I–P, bằng chứng meta-analytic của Marano et al. (2016) — phân tích 170 nghiên cứu với 32 quốc gia giai đoạn 1972–2012 — cho thấy thể chế quốc gia nguồn điều tiết đáng kể mối quan hệ quốc tế hóa — hiệu quả, với doanh nghiệp từ các nền kinh tế có thể chế yếu hơn có xu hướng thu được lợi ích thấp hơn hoặc thậm chí tổn thất từ quốc tế hóa. Cuervo-Cazurra et al. (2018) bổ sung rằng bất định thể chế ở quốc gia nguồn (home country uncertainty) không chỉ tạo ra thách thức mà còn có thể xây dựng năng lực quản lý bất định đặc thù, giúp doanh nghiệp ở các thị trường mới nổi cạnh tranh hiệu quả hơn ở các thị trường nước ngoài có đặc điểm tương tự. Lý thuyết thể chế cung cấp nền tảng lý luận cho giả thuyết H5 và cho khung ICRV trong luận án.</w:t>
+        <w:t xml:space="preserve">North (1990) chỉ ra rằng thể chế hiệu quả làm giảm chi phí giao dịch, bảo vệ quyền sở hữu trí tuệ, và tạo ra môi trường khuyến khích đầu tư dài hạn. Ngược lại, ở các nền kinh tế đang phát triển, sự vắng mặt hoặc yếu kém của các thể chế trung gian thị trường — từ hệ thống pháp lý đến thị trường vốn, từ tổ chức đánh giá tín nhiệm đến hiệp hội ngành nghề — tạo ra</w:t>
+      </w:r>
+      <w:r>
+        <w:t xml:space="preserve"> </w:t>
+      </w:r>
+      <w:r>
+        <w:t xml:space="preserve">“</w:t>
+      </w:r>
+      <w:r>
+        <w:t xml:space="preserve">khoảng trống thể chế</w:t>
+      </w:r>
+      <w:r>
+        <w:t xml:space="preserve">”</w:t>
+      </w:r>
+      <w:r>
+        <w:t xml:space="preserve"> </w:t>
+      </w:r>
+      <w:r>
+        <w:t xml:space="preserve">(institutional voids) làm tăng chi phí giao dịch và rủi ro cho doanh nghiệp khi hoạt động hoặc mở rộng ra nước ngoài (Khanna &amp; Palepu, 2010).</w:t>
+      </w:r>
+    </w:p>
+    <w:p>
+      <w:pPr>
+        <w:pStyle w:val="BodyText"/>
+      </w:pPr>
+      <w:r>
+        <w:t xml:space="preserve">Trong literature về I–P, bằng chứng meta-analytic của Marano et al. (2016) — phân tích 170 nghiên cứu với 32 quốc gia giai đoạn 1972–2012 — cho thấy thể chế quốc gia nguồn điều tiết đáng kể mối quan hệ quốc tế hóa — hiệu quả, với doanh nghiệp từ các nền kinh tế có thể chế yếu hơn có xu hướng thu được lợi ích thấp hơn hoặc thậm chí tổn thất từ quốc tế hóa. Cuervo-Cazurra et al. (2018) bổ sung rằng bất định thể chế ở quốc gia nguồn (home country uncertainty) không chỉ tạo ra thách thức mà còn có thể xây dựng năng lực quản lý bất định đặc thù, giúp doanh nghiệp ở các thị trường mới nổi cạnh tranh hiệu quả hơn ở các thị trường nước ngoài có đặc điểm tương tự. Lý thuyết thể chế cung cấp nền tảng lý luận cho giả thuyết H5 và cho khung ICRV trong luận án.</w:t>
       </w:r>
     </w:p>
     <w:bookmarkEnd w:id="27"/>
-    <w:bookmarkStart w:id="28" w:name="X146ba0dc244c296ae552c63cd5ae9ae43aef1fe"/>
+    <w:bookmarkStart w:id="28" w:name="lý-thuyết-thượng-tầng-quản-trị"/>
     <w:p>
       <w:pPr>
         <w:pStyle w:val="Heading3"/>
@@ -312,7 +456,25 @@
         <w:pStyle w:val="FirstParagraph"/>
       </w:pPr>
       <w:r>
-        <w:t xml:space="preserve">Lý thuyết thượng tầng quản trị (Upper Echelons Theory) do Hambrick và Mason (1984) đề xuất và được Hambrick (2007) cập nhật, cho rằng các quyết định chiến lược lớn và kết quả của tổ chức không phải là sản phẩm của các quy trình duy lý hoàn toàn, mà phản ánh đặc điểm nhận thức, giá trị và kinh nghiệm của nhà quản trị cấp cao. Nói cách khác, "tổ chức là sự phản chiếu của nhà quản trị đỉnh cao" (Hambrick &amp; Mason, 1984, tr. 193).</w:t>
+        <w:t xml:space="preserve">Lý thuyết thượng tầng quản trị (Upper Echelons Theory) do Hambrick và Mason (1984) đề xuất và được Hambrick (2007) cập nhật, cho rằng các quyết định chiến lược lớn và kết quả của tổ chức không phải là sản phẩm của các quy trình duy lý hoàn toàn, mà phản ánh đặc điểm nhận thức, giá trị và kinh nghiệm của nhà quản trị cấp cao. Nói cách khác,</w:t>
+      </w:r>
+      <w:r>
+        <w:t xml:space="preserve"> </w:t>
+      </w:r>
+      <w:r>
+        <w:t xml:space="preserve">“</w:t>
+      </w:r>
+      <w:r>
+        <w:t xml:space="preserve">tổ chức là sự phản chiếu của nhà quản trị đỉnh cao</w:t>
+      </w:r>
+      <w:r>
+        <w:t xml:space="preserve">”</w:t>
+      </w:r>
+      <w:r>
+        <w:t xml:space="preserve"> </w:t>
+      </w:r>
+      <w:r>
+        <w:t xml:space="preserve">(Hambrick &amp; Mason, 1984, tr. 193).</w:t>
       </w:r>
     </w:p>
     <w:p>
@@ -324,7 +486,7 @@
       </w:r>
     </w:p>
     <w:bookmarkEnd w:id="28"/>
-    <w:bookmarkStart w:id="29" w:name="X755678d15ddc1a8c13dbc8244350f9a59bba034"/>
+    <w:bookmarkStart w:id="29" w:name="lớp-mở-rộng-digital-capability-lens"/>
     <w:p>
       <w:pPr>
         <w:pStyle w:val="Heading3"/>
@@ -346,7 +508,7 @@
         <w:pStyle w:val="BodyText"/>
       </w:pPr>
       <w:r>
-        <w:t xml:space="preserve">Banalieva và Dhanaraj (2019) là một trong những nghiên cứu đầu tiên đề xuất cập nhật lý thuyết nội hóa (internalization theory) cho nền kinh tế số, lập luận rằng dữ liệu số và tương tác dựa trên nền tảng làm giảm sự phụ thuộc vào hiện diện vật lý và thay đổi cơ bản logic về quyết định nội hóa. Stallkamp và Schotter (2021) mở rộng luận điểm này bằng cách chỉ ra rằng các doanh nghiệp nền tảng (platform firms) quốc tế hóa theo logic đa diện (multi-sided) khác hẳn với các MNCs truyền thống, với hiệu ứng mạng lưới tạo ra lợi thế quy mô không bị ràng buộc bởi biên giới địa lý. Verhoef et al. (2021) cung cấp khung khái niệm phân tầng ba cấp độ: số hóa thông tin (digitization), số hóa quy trình (digitalization), và chuyển đổi số toàn diện (digital transformation), nhấn mạnh rằng các cấp độ này khác nhau về chiều sâu tổ chức và tác động kinh doanh. Yang et al. (2025) bổ sung bằng systematic review về quốc tế hóa của các doanh nghiệp số, phác thảo các lý thuyết cần điều chỉnh và hướng nghiên cứu tiếp theo.</w:t>
+        <w:t xml:space="preserve">Banalieva và Dhanaraj (2019) là một trong những nghiên cứu đầu tiên đề xuất cập nhật lý thuyết nội hóa (internalization theory) cho nền kinh tế số, lập luận rằng dữ liệu số và tương tác dựa trên nền tảng làm giảm sự phụ thuộc vào hiện diện vật lý và thay đổi cơ bản logic về quyết định nội hóa. Stallkamp và Schotter (2021) mở rộng luận điểm này bằng cách chỉ ra rằng các doanh nghiệp nền tảng (platform firms) quốc tế hóa theo logic đa diện (multi-sided) khác hẳn với các MNCs truyền thống, với hiệu ứng mạng lưới tạo ra lợi thế quy mô không bị ràng buộc bởi biên giới địa lý. Verhoef et al. (2021) cung cấp khung khái niệm phân tầng ba cấp độ: số hóa thông tin (digitization), số hóa quy trình (digitalization), và chuyển đổi số toàn diện (digital transformation), nhấn mạnh rằng các cấp độ này khác nhau về chiều sâu tổ chức và tác động kinh doanh. Yang et al. (2025) bổ sung bằng systematic review về quốc tế hóa của các doanh nghiệp số, phác thảo các lý thuyết cần điều chỉnh và hướng nghiên cứu tiếp theo.</w:t>
       </w:r>
     </w:p>
     <w:p>
@@ -366,7 +528,7 @@
     </w:p>
     <w:bookmarkEnd w:id="29"/>
     <w:bookmarkEnd w:id="30"/>
-    <w:bookmarkStart w:id="35" w:name="Xb68718caf7a2cd6e9eb5a792769262881ac883e"/>
+    <w:bookmarkStart w:id="35" w:name="tổng-quan-thực-nghiệm"/>
     <w:p>
       <w:pPr>
         <w:pStyle w:val="Heading2"/>
@@ -375,7 +537,7 @@
         <w:t xml:space="preserve">2.3 Tổng quan thực nghiệm</w:t>
       </w:r>
     </w:p>
-    <w:bookmarkStart w:id="31" w:name="Xdced885a630e2fc91d9034fc02dca256c5d6811"/>
+    <w:bookmarkStart w:id="31" w:name="giai-đoạn-phát-triển-của-literature-ip"/>
     <w:p>
       <w:pPr>
         <w:pStyle w:val="Heading3"/>
@@ -397,15 +559,33 @@
         <w:pStyle w:val="BodyText"/>
       </w:pPr>
       <w:r>
-        <w:t xml:space="preserve">Giai đoạn đầu (từ thập niên 1980 đến giữa thập niên 1990) đặc trưng bởi giả định về quan hệ tuyến tính dương giữa quốc tế hóa và hiệu quả. Grant (1987) và Kim et al. (1989) cho rằng quốc tế hóa giúp doanh nghiệp khai thác lợi thế theo quy mô (economies of scale), lợi thế phạm vi (economies of scope), và phân tán rủi ro kinh tế vĩ mô, do đó dẫn đến hiệu quả cao hơn. Logic này trực quan và phù hợp với quan sát ban đầu về các MNCs thành công từ Mỹ, Châu Âu và Nhật Bản.</w:t>
-      </w:r>
-    </w:p>
-    <w:p>
-      <w:pPr>
-        <w:pStyle w:val="BodyText"/>
-      </w:pPr>
-      <w:r>
-        <w:t xml:space="preserve">Giai đoạn thứ hai (từ cuối thập niên 1990 đến đầu thập niên 2000) chứng kiến sự xuất hiện của mô hình phi tuyến, thách thức giả định tuyến tính giản đơn. Hitt et al. (1997) là nghiên cứu đầu tiên kiểm định và tìm thấy bằng chứng cho quan hệ chữ U ngược (inverted-U) giữa đa dạng hóa sản phẩm quốc tế và hiệu quả, lập luận rằng lợi ích từ quốc tế hóa tăng đến một điểm tối ưu rồi suy giảm do chi phí điều phối và phức tạp tổ chức vượt qua lợi ích. Gomes và Ramaswamy (1999) cung cấp bằng chứng tương tự trong bối cảnh doanh nghiệp đa ngành. Contractor et al. (2003) và Lu và Beamish (2004) tinh chỉnh mô hình phi tuyến với đề xuất "đường cong chữ S ba giai đoạn" (three-stage S-curve), theo đó hiệu quả giảm ở giai đoạn thâm nhập ban đầu (chi phí thiết lập), tăng ở giai đoạn khai thác (học hỏi tích lũy và quy mô), rồi lại giảm ở giai đoạn siêu mở rộng (over-extension) khi chi phí phức tạp vượt quá lợi ích.</w:t>
+        <w:t xml:space="preserve">Giai đoạn đầu (từ thập niên 1980 đến giữa thập niên 1990) đặc trưng bởi giả định về quan hệ tuyến tính dương giữa quốc tế hóa và hiệu quả. Grant (1987) và Kim et al. (1989) cho rằng quốc tế hóa giúp doanh nghiệp khai thác lợi thế theo quy mô (economies of scale), lợi thế phạm vi (economies of scope), và phân tán rủi ro kinh tế vĩ mô, do đó dẫn đến hiệu quả cao hơn. Logic này trực quan và phù hợp với quan sát ban đầu về các MNCs thành công từ Mỹ, Châu Âu và Nhật Bản.</w:t>
+      </w:r>
+    </w:p>
+    <w:p>
+      <w:pPr>
+        <w:pStyle w:val="BodyText"/>
+      </w:pPr>
+      <w:r>
+        <w:t xml:space="preserve">Giai đoạn thứ hai (từ cuối thập niên 1990 đến đầu thập niên 2000) chứng kiến sự xuất hiện của mô hình phi tuyến, thách thức giả định tuyến tính giản đơn. Hitt et al. (1997) là nghiên cứu đầu tiên kiểm định và tìm thấy bằng chứng cho quan hệ chữ U ngược (inverted-U) giữa đa dạng hóa sản phẩm quốc tế và hiệu quả, lập luận rằng lợi ích từ quốc tế hóa tăng đến một điểm tối ưu rồi suy giảm do chi phí điều phối và phức tạp tổ chức vượt qua lợi ích. Gomes và Ramaswamy (1999) cung cấp bằng chứng tương tự trong bối cảnh doanh nghiệp đa ngành. Contractor et al. (2003) và Lu và Beamish (2004) tinh chỉnh mô hình phi tuyến với đề xuất</w:t>
+      </w:r>
+      <w:r>
+        <w:t xml:space="preserve"> </w:t>
+      </w:r>
+      <w:r>
+        <w:t xml:space="preserve">“</w:t>
+      </w:r>
+      <w:r>
+        <w:t xml:space="preserve">đường cong chữ S ba giai đoạn</w:t>
+      </w:r>
+      <w:r>
+        <w:t xml:space="preserve">”</w:t>
+      </w:r>
+      <w:r>
+        <w:t xml:space="preserve"> </w:t>
+      </w:r>
+      <w:r>
+        <w:t xml:space="preserve">(three-stage S-curve), theo đó hiệu quả giảm ở giai đoạn thâm nhập ban đầu (chi phí thiết lập), tăng ở giai đoạn khai thác (học hỏi tích lũy và quy mô), rồi lại giảm ở giai đoạn siêu mở rộng (over-extension) khi chi phí phức tạp vượt quá lợi ích.</w:t>
       </w:r>
     </w:p>
     <w:p>
@@ -417,7 +597,7 @@
       </w:r>
     </w:p>
     <w:bookmarkEnd w:id="31"/>
-    <w:bookmarkStart w:id="32" w:name="X1a2e519e3eb745ccb5a9310ee8e928b32e9ba76"/>
+    <w:bookmarkStart w:id="32" w:name="bằng-chứng-meta-analytic"/>
     <w:p>
       <w:pPr>
         <w:pStyle w:val="Heading3"/>
@@ -439,7 +619,7 @@
         <w:pStyle w:val="BodyText"/>
       </w:pPr>
       <w:r>
-        <w:t xml:space="preserve">Bausch và Krist (2007) phân tích 65 nghiên cứu và tìm thấy tác động tổng hợp dương nhưng nhỏ (r ≈ 0,10), đồng thời xác nhận rằng mức độ dị biệt (heterogeneity) giữa các nghiên cứu rất cao với I² &gt; 80%, hàm ý rằng các moderator là nguồn giải thích chủ yếu cho sự khác biệt. Kirca et al. (2012) mở rộng pool lên 154 mẫu và tìm thấy tác động tổng hợp tương tự, đồng thời xác nhận vai trò của bối cảnh quốc gia và ngành. Marano et al. (2016) — nghiên cứu meta-analytic toàn diện nhất trong literature với 170 nghiên cứu và 32 quốc gia — tìm thấy r ≈ 0,07–0,13 và chứng minh rằng thể chế quốc gia nguồn là moderator quan trọng nhất trong tất cả các biến bối cảnh được kiểm định. Wu et al. (2022) cập nhật với pool 218 effect sizes tập trung vào các emerging market multinationals (EMNEs) và tìm thấy mô hình moderator tương tự. Tại hội nghị ICBEF 2024, kết quả sơ bộ từ pool nghiên cứu về châu Á với k = 113 nghiên cứu cho thấy r = 0,07 — nhất quán với các meta-analyses toàn cầu nhưng cụ thể hơn về bối cảnh châu Á. Luận án này mở rộng pool đó thông qua Nghiên cứu P6 — một meta-analysis ba tầng (three-level MARA) với k = 238 nghiên cứu và K = 288 effect sizes từ châu Á và Thái Bình Dương, ước lượng r̄ = 0,074 [KTC 95%: 0,060; 0,088], I² = 62,4%, Q_M(ICRV) = 17,35 (df = 4, p = ,002). Kết quả này xác nhận tác động tổng hợp dương nhỏ nhưng bền vững, đồng thời chứng minh rằng gradient ICRV — turning point giảm dần khi chuyển từ thể chế yếu sang thể chế mạnh — là moderator thực chất của mối quan hệ I–P trong bối cảnh châu Á (nghiên cứu thành phần P6).</w:t>
+        <w:t xml:space="preserve">Bausch và Krist (2007) phân tích 65 nghiên cứu và tìm thấy tác động tổng hợp dương nhưng nhỏ (r ≈ 0,10), đồng thời xác nhận rằng mức độ dị biệt (heterogeneity) giữa các nghiên cứu rất cao với I² &gt; 80%, hàm ý rằng các moderator là nguồn giải thích chủ yếu cho sự khác biệt. Kirca et al. (2012) mở rộng pool lên 154 mẫu và tìm thấy tác động tổng hợp tương tự, đồng thời xác nhận vai trò của bối cảnh quốc gia và ngành. Marano et al. (2016) — nghiên cứu meta-analytic toàn diện nhất trong literature với 170 nghiên cứu và 32 quốc gia — tìm thấy r ≈ 0,07–0,13 và chứng minh rằng thể chế quốc gia nguồn là moderator quan trọng nhất trong tất cả các biến bối cảnh được kiểm định. Wu et al. (2022) cập nhật với pool 218 effect sizes tập trung vào các emerging market multinationals (EMNEs) và tìm thấy mô hình moderator tương tự. Tại hội nghị ICBEF 2024, kết quả sơ bộ từ pool nghiên cứu về châu Á với k = 113 nghiên cứu cho thấy r = 0,07 — nhất quán với các meta-analyses toàn cầu nhưng cụ thể hơn về bối cảnh châu Á. Luận án này mở rộng pool đó thông qua Nghiên cứu P6 — một meta-analysis ba tầng (three-level MARA) với k = 238 nghiên cứu và K = 288 effect sizes từ châu Á và Thái Bình Dương, ước lượng r̄ = 0,074 [KTC 95%: 0,060; 0,088], I² = 62,4%, Q_M(ICRV) = 17,35 (df = 4, p = ,002). Kết quả này xác nhận tác động tổng hợp dương nhỏ nhưng bền vững, đồng thời chứng minh rằng gradient ICRV — turning point giảm dần khi chuyển từ thể chế yếu sang thể chế mạnh — là moderator thực chất của mối quan hệ I–P trong bối cảnh châu Á (nghiên cứu thành phần P6).</w:t>
       </w:r>
     </w:p>
     <w:p>
@@ -451,7 +631,7 @@
       </w:r>
     </w:p>
     <w:bookmarkEnd w:id="32"/>
-    <w:bookmarkStart w:id="33" w:name="Xee1bebe325ab2d4682f3ee8a885eb236c48b900"/>
+    <w:bookmarkStart w:id="33" w:name="X2dab31dc90ae94a491c7104c141028484c6eeaa"/>
     <w:p>
       <w:pPr>
         <w:pStyle w:val="Heading3"/>
@@ -465,15 +645,51 @@
         <w:pStyle w:val="FirstParagraph"/>
       </w:pPr>
       <w:r>
-        <w:t xml:space="preserve">Châu Á là bối cảnh đặc biệt quan trọng và đặc thù trong literature I–P vì nhiều lý do. Thứ nhất, sự đa dạng thể chế trong khu vực là ngoại lệ không có ở bất kỳ khu vực nào khác trên thế giới: từ Singapore với chất lượng quản trị đứng hàng đầu thế giới đến Afghanistan với chất lượng quản trị cực kỳ yếu, từ Nhật Bản với nền kinh tế phát triển hoàn thiện đến các SIDS với quy mô siêu nhỏ và hạ tầng thể chế còn sơ khai (Khanna &amp; Palepu, 2010; Peng, 2003). Thứ hai, tốc độ chuyển đổi số và hội nhập quốc tế rất không đồng đều giữa các quốc gia trong khu vực, tạo ra "thí nghiệm tự nhiên" về ảnh hưởng của bối cảnh thể chế và năng lực số đến kết quả quốc tế hóa.</w:t>
-      </w:r>
-    </w:p>
-    <w:p>
-      <w:pPr>
-        <w:pStyle w:val="BodyText"/>
-      </w:pPr>
-      <w:r>
-        <w:t xml:space="preserve">nghiên cứu thành phần P1 là nghiên cứu thực nghiệm multi-country quy mô lớn nhất hiện có về I–P trong bối cảnh châu Á mới nổi, phân tích 40.633 doanh nghiệp từ 17 nền kinh tế châu Á sử dụng dữ liệu WBES. Nghiên cứu tìm thấy: (i) tồn tại phân tầng năng suất rõ rệt giữa nhóm Chinese economies, South Asia và ASEAN, phản ánh sự dị biệt thể chế và năng lực giữa các nhóm; (ii) việc áp dụng công nghệ vừa làm tăng năng suất lao động trực tiếp vừa làm suy giảm đáng kể tác động bất lợi của các rào cản thể chế — phát hiện được gọi là "hiệu ứng lá chắn số" (digital shield effect). Nghiên cứu thành phần P2 kiểm định cụ thể với dữ liệu doanh nghiệp Trung Quốc và tìm thấy cấu trúc cubic inverted-U với ngưỡng FSTS tối ưu khoảng 47,8% — tức điểm turning point khá thấp so với các nền kinh tế tiên tiến. Luận án kế thừa và mở rộng các kết quả này trên pool đầy đủ 49 nền kinh tế (bao gồm 9 nền kinh tế đảo nhỏ Thái Bình Dương).</w:t>
+        <w:t xml:space="preserve">Châu Á là bối cảnh đặc biệt quan trọng và đặc thù trong literature I–P vì nhiều lý do. Thứ nhất, sự đa dạng thể chế trong khu vực là ngoại lệ không có ở bất kỳ khu vực nào khác trên thế giới: từ Singapore với chất lượng quản trị đứng hàng đầu thế giới đến Afghanistan với chất lượng quản trị cực kỳ yếu, từ Nhật Bản với nền kinh tế phát triển hoàn thiện đến các SIDS với quy mô siêu nhỏ và hạ tầng thể chế còn sơ khai (Khanna &amp; Palepu, 2010; Peng, 2003). Thứ hai, tốc độ chuyển đổi số và hội nhập quốc tế rất không đồng đều giữa các quốc gia trong khu vực, tạo ra</w:t>
+      </w:r>
+      <w:r>
+        <w:t xml:space="preserve"> </w:t>
+      </w:r>
+      <w:r>
+        <w:t xml:space="preserve">“</w:t>
+      </w:r>
+      <w:r>
+        <w:t xml:space="preserve">thí nghiệm tự nhiên</w:t>
+      </w:r>
+      <w:r>
+        <w:t xml:space="preserve">”</w:t>
+      </w:r>
+      <w:r>
+        <w:t xml:space="preserve"> </w:t>
+      </w:r>
+      <w:r>
+        <w:t xml:space="preserve">về ảnh hưởng của bối cảnh thể chế và năng lực số đến kết quả quốc tế hóa.</w:t>
+      </w:r>
+    </w:p>
+    <w:p>
+      <w:pPr>
+        <w:pStyle w:val="BodyText"/>
+      </w:pPr>
+      <w:r>
+        <w:t xml:space="preserve">nghiên cứu thành phần P1 là nghiên cứu thực nghiệm multi-country quy mô lớn nhất hiện có về I–P trong bối cảnh châu Á mới nổi, phân tích 40.633 doanh nghiệp từ 17 nền kinh tế châu Á sử dụng dữ liệu WBES. Nghiên cứu tìm thấy: (i) tồn tại phân tầng năng suất rõ rệt giữa nhóm Chinese economies, South Asia và ASEAN, phản ánh sự dị biệt thể chế và năng lực giữa các nhóm; (ii) việc áp dụng công nghệ vừa làm tăng năng suất lao động trực tiếp vừa làm suy giảm đáng kể tác động bất lợi của các rào cản thể chế — phát hiện được gọi là</w:t>
+      </w:r>
+      <w:r>
+        <w:t xml:space="preserve"> </w:t>
+      </w:r>
+      <w:r>
+        <w:t xml:space="preserve">“</w:t>
+      </w:r>
+      <w:r>
+        <w:t xml:space="preserve">hiệu ứng lá chắn số</w:t>
+      </w:r>
+      <w:r>
+        <w:t xml:space="preserve">”</w:t>
+      </w:r>
+      <w:r>
+        <w:t xml:space="preserve"> </w:t>
+      </w:r>
+      <w:r>
+        <w:t xml:space="preserve">(digital shield effect). Nghiên cứu thành phần P2 kiểm định cụ thể với dữ liệu doanh nghiệp Trung Quốc và tìm thấy cấu trúc cubic inverted-U với ngưỡng FSTS tối ưu khoảng 47,8% — tức điểm turning point khá thấp so với các nền kinh tế tiên tiến. Luận án kế thừa và mở rộng các kết quả này trên pool đầy đủ 49 nền kinh tế (bao gồm 9 nền kinh tế đảo nhỏ Thái Bình Dương).</w:t>
       </w:r>
     </w:p>
     <w:p>
@@ -485,7 +701,7 @@
       </w:r>
     </w:p>
     <w:bookmarkEnd w:id="33"/>
-    <w:bookmarkStart w:id="34" w:name="Xdcf8d5acfbfe96d373642e6e2aa58fc72c4137f"/>
+    <w:bookmarkStart w:id="34" w:name="X732d7d1b7e90f1451ce2bd542fd674aab0604d1"/>
     <w:p>
       <w:pPr>
         <w:pStyle w:val="Heading3"/>
@@ -499,7 +715,7 @@
         <w:pStyle w:val="FirstParagraph"/>
       </w:pPr>
       <w:r>
-        <w:t xml:space="preserve">Sự tích hợp giữa nghiên cứu về năng lực số và I–P relationship là một xu hướng tương đối mới, phát triển mạnh từ 2019 đến nay. Bhandari et al. (2023) phân tích 571 doanh nghiệp sản xuất của Mỹ và tìm thấy rằng năng lực kỹ thuật số (được đo như một composite duy nhất) điều tiết tích cực mối quan hệ I–P, với doanh nghiệp có năng lực số cao hơn thu được lợi ích lớn hơn từ quốc tế hóa. Bustamante et al. (2022) sử dụng mẫu SMEs đa quốc gia và phát hiện rằng công cụ số làm giảm chi phí thâm nhập thị trường nước ngoài, đặc biệt ở các thị trường có khoảng trống thể chế lớn. Chen và Meng (2022) nghiên cứu doanh nghiệp Trung Quốc từ WBES và phát hiện rằng ràng buộc thể chế làm giảm cường độ xuất khẩu, nhưng doanh nghiệp có năng lực số cao hơn có thể vượt qua ràng buộc này hiệu quả hơn.</w:t>
+        <w:t xml:space="preserve">Sự tích hợp giữa nghiên cứu về năng lực số và I–P relationship là một xu hướng tương đối mới, phát triển mạnh từ 2019 đến nay. Bhandari et al. (2023) phân tích 571 doanh nghiệp sản xuất của Mỹ và tìm thấy rằng năng lực kỹ thuật số (được đo như một composite duy nhất) điều tiết tích cực mối quan hệ I–P, với doanh nghiệp có năng lực số cao hơn thu được lợi ích lớn hơn từ quốc tế hóa. Bustamante et al. (2022) sử dụng mẫu SMEs đa quốc gia và phát hiện rằng công cụ số làm giảm chi phí thâm nhập thị trường nước ngoài, đặc biệt ở các thị trường có khoảng trống thể chế lớn. Chen và Meng (2022) nghiên cứu doanh nghiệp Trung Quốc từ WBES và phát hiện rằng ràng buộc thể chế làm giảm cường độ xuất khẩu, nhưng doanh nghiệp có năng lực số cao hơn có thể vượt qua ràng buộc này hiệu quả hơn.</w:t>
       </w:r>
     </w:p>
     <w:p>
@@ -519,7 +735,7 @@
     </w:p>
     <w:bookmarkEnd w:id="34"/>
     <w:bookmarkEnd w:id="35"/>
-    <w:bookmarkStart w:id="36" w:name="Xf45ba9d58640f4ad8d0eb51a37a564f5aeb40a8"/>
+    <w:bookmarkStart w:id="36" w:name="khoảng-trống-nghiên-cứu"/>
     <w:p>
       <w:pPr>
         <w:pStyle w:val="Heading2"/>
@@ -631,7 +847,25 @@
         <w:t xml:space="preserve"> </w:t>
       </w:r>
       <w:r>
-        <w:t xml:space="preserve">Khoảng trống thứ ba không chỉ đòi hỏi mở rộng phạm vi địa lý mà còn đòi hỏi kiểm định điều kiện biên lý thuyết cực trị: liệu có tồn tại bối cảnh nơi inverted-U hoàn toàn sụp đổ thành quan hệ âm đơn điệu? Không có nghiên cứu nào trong literature I–P hiện tại kiểm định "Forced Internationalization Penalty" (FIP) — bối cảnh mà quốc tế hóa là gánh nặng sinh tồn, không phải lựa chọn chiến lược dựa trên lợi thế cạnh tranh. Nghiên cứu thành phần P8 — Nghiên cứu P8 — kiểm định H1b bằng dữ liệu WBES từ các nền kinh tế SIDS (Fiji, Tonga, Solomon Islands, Vanuatu, Samoa), nơi ba điều kiện cấu trúc cơ bản của inverted-U đồng thời bị vi phạm: thị trường nội địa cực nhỏ, chi phí logistics cao bất thường, và hỗ trợ thể chế cho xuất khẩu gần như không tồn tại. Kết quả P8 xác định boundary condition cực trị của CDCM: điểm nơi lý thuyết đường cong chữ U ngược không còn ứng dụng được.</w:t>
+        <w:t xml:space="preserve">Khoảng trống thứ ba không chỉ đòi hỏi mở rộng phạm vi địa lý mà còn đòi hỏi kiểm định điều kiện biên lý thuyết cực trị: liệu có tồn tại bối cảnh nơi inverted-U hoàn toàn sụp đổ thành quan hệ âm đơn điệu? Không có nghiên cứu nào trong literature I–P hiện tại kiểm định</w:t>
+      </w:r>
+      <w:r>
+        <w:t xml:space="preserve"> </w:t>
+      </w:r>
+      <w:r>
+        <w:t xml:space="preserve">“</w:t>
+      </w:r>
+      <w:r>
+        <w:t xml:space="preserve">Forced Internationalization Penalty</w:t>
+      </w:r>
+      <w:r>
+        <w:t xml:space="preserve">”</w:t>
+      </w:r>
+      <w:r>
+        <w:t xml:space="preserve"> </w:t>
+      </w:r>
+      <w:r>
+        <w:t xml:space="preserve">(FIP) — bối cảnh mà quốc tế hóa là gánh nặng sinh tồn, không phải lựa chọn chiến lược dựa trên lợi thế cạnh tranh. Nghiên cứu thành phần P8 — Nghiên cứu P8 — kiểm định H1b bằng dữ liệu WBES từ các nền kinh tế SIDS (Fiji, Tonga, Solomon Islands, Vanuatu, Samoa), nơi ba điều kiện cấu trúc cơ bản của inverted-U đồng thời bị vi phạm: thị trường nội địa cực nhỏ, chi phí logistics cao bất thường, và hỗ trợ thể chế cho xuất khẩu gần như không tồn tại. Kết quả P8 xác định boundary condition cực trị của CDCM: điểm nơi lý thuyết đường cong chữ U ngược không còn ứng dụng được.</w:t>
       </w:r>
     </w:p>
     <w:p>
@@ -642,7 +876,7 @@
       </w:r>
     </w:p>
     <w:bookmarkEnd w:id="36"/>
-    <w:bookmarkStart w:id="49" w:name="X2e72411c23c34d41d1942bd5d4fbf8ae22da5d2"/>
+    <w:bookmarkStart w:id="49" w:name="mô-hình-nghiên-cứu-và-hệ-giả-thuyết"/>
     <w:p>
       <w:pPr>
         <w:pStyle w:val="Heading2"/>
@@ -651,7 +885,7 @@
         <w:t xml:space="preserve">2.5 Mô hình nghiên cứu và hệ giả thuyết</w:t>
       </w:r>
     </w:p>
-    <w:bookmarkStart w:id="40" w:name="X45cacfa706139c50548e97564081354b0b3764b"/>
+    <w:bookmarkStart w:id="40" w:name="mô-hình-khái-niệm"/>
     <w:p>
       <w:pPr>
         <w:pStyle w:val="Heading3"/>
@@ -681,7 +915,43 @@
         <w:pStyle w:val="BodyText"/>
       </w:pPr>
       <w:r>
-        <w:t xml:space="preserve">Tầng tổ chức — năng lực doanh nghiệp — bao gồm TCI và DAI như hai moderator độc lập với cơ chế tác động khác nhau. TCI đóng vai trò như một "nâng đỡ mặt bằng" (level shifter): doanh nghiệp có TCI cao sẽ đạt hiệu quả cao hơn ở mọi mức độ FSTS, và đặc biệt có khả năng khai thác lợi ích quốc tế hóa tốt hơn nhờ năng lực hấp thụ tri thức và công nghệ từ thị trường nước ngoài. DAI, ngược lại, đóng vai trò là "bộ đệm phối hợp số" (digital coordination buffer): ở mức FSTS cao, DAI giúp giảm chi phí điều phối xuyên biên giới, làm chuyển dịch điểm turning point sang phải và kéo dài giai đoạn lợi ích dương của quan hệ I–P.</w:t>
+        <w:t xml:space="preserve">Tầng tổ chức — năng lực doanh nghiệp — bao gồm TCI và DAI như hai moderator độc lập với cơ chế tác động khác nhau. TCI đóng vai trò như một</w:t>
+      </w:r>
+      <w:r>
+        <w:t xml:space="preserve"> </w:t>
+      </w:r>
+      <w:r>
+        <w:t xml:space="preserve">“</w:t>
+      </w:r>
+      <w:r>
+        <w:t xml:space="preserve">nâng đỡ mặt bằng</w:t>
+      </w:r>
+      <w:r>
+        <w:t xml:space="preserve">”</w:t>
+      </w:r>
+      <w:r>
+        <w:t xml:space="preserve"> </w:t>
+      </w:r>
+      <w:r>
+        <w:t xml:space="preserve">(level shifter): doanh nghiệp có TCI cao sẽ đạt hiệu quả cao hơn ở mọi mức độ FSTS, và đặc biệt có khả năng khai thác lợi ích quốc tế hóa tốt hơn nhờ năng lực hấp thụ tri thức và công nghệ từ thị trường nước ngoài. DAI, ngược lại, đóng vai trò là</w:t>
+      </w:r>
+      <w:r>
+        <w:t xml:space="preserve"> </w:t>
+      </w:r>
+      <w:r>
+        <w:t xml:space="preserve">“</w:t>
+      </w:r>
+      <w:r>
+        <w:t xml:space="preserve">bộ đệm phối hợp số</w:t>
+      </w:r>
+      <w:r>
+        <w:t xml:space="preserve">”</w:t>
+      </w:r>
+      <w:r>
+        <w:t xml:space="preserve"> </w:t>
+      </w:r>
+      <w:r>
+        <w:t xml:space="preserve">(digital coordination buffer): ở mức FSTS cao, DAI giúp giảm chi phí điều phối xuyên biên giới, làm chuyển dịch điểm turning point sang phải và kéo dài giai đoạn lợi ích dương của quan hệ I–P.</w:t>
       </w:r>
     </w:p>
     <w:p>
@@ -702,12 +972,12 @@
     </w:p>
     <w:p>
       <w:pPr>
-        <w:pStyle w:val="BodyText"/>
+        <w:pStyle w:val="CaptionedFigure"/>
       </w:pPr>
       <w:r>
         <w:drawing>
           <wp:inline>
-            <wp:extent cx="5753100" cy="3558086"/>
+            <wp:extent cx="5334000" cy="3298888"/>
             <wp:effectExtent b="0" l="0" r="0" t="0"/>
             <wp:docPr descr="Hình 2.1. Khung khái niệm tích hợp đa tầng CDCM cho quan hệ Quốc tế hóa–Hiệu quả tại châu Á" title="" id="38" name="Picture"/>
             <a:graphic>
@@ -728,7 +998,7 @@
                   <pic:spPr bwMode="auto">
                     <a:xfrm>
                       <a:off x="0" y="0"/>
-                      <a:ext cx="5753100" cy="3558086"/>
+                      <a:ext cx="5334000" cy="3298888"/>
                     </a:xfrm>
                     <a:prstGeom prst="rect">
                       <a:avLst/>
@@ -749,6 +1019,14 @@
     </w:p>
     <w:p>
       <w:pPr>
+        <w:pStyle w:val="ImageCaption"/>
+      </w:pPr>
+      <w:r>
+        <w:t xml:space="preserve">Hình 2.1. Khung khái niệm tích hợp đa tầng CDCM cho quan hệ Quốc tế hóa–Hiệu quả tại châu Á</w:t>
+      </w:r>
+    </w:p>
+    <w:p>
+      <w:pPr>
         <w:pStyle w:val="BodyText"/>
       </w:pPr>
       <w:r>
@@ -786,7 +1064,7 @@
       </w:r>
     </w:p>
     <w:bookmarkEnd w:id="40"/>
-    <w:bookmarkStart w:id="41" w:name="Xa138305ccd4d6ccfbd8098a87bf493c47bc52a0"/>
+    <w:bookmarkStart w:id="41" w:name="giả-thuyết-h1-phi-tuyến-chữ-u-ngược"/>
     <w:p>
       <w:pPr>
         <w:pStyle w:val="Heading3"/>
@@ -800,11 +1078,11 @@
         <w:pStyle w:val="FirstParagraph"/>
       </w:pPr>
       <w:r>
-        <w:t xml:space="preserve">Trên cơ sở lý thuyết từ Uppsala về chi phí thâm nhập giai đoạn đầu, RBV về lợi thế cạnh tranh tích lũy ở giai đoạn trung, và lý thuyết chi phí giao dịch về sự phức tạp điều phối ở giai đoạn mở rộng quá mức, giả thuyết H1 được phát biểu như sau. Quan hệ giữa mức độ quốc tế hóa và hiệu quả hoạt động của các doanh nghiệp ở các quốc gia châu Á có dạng phi tuyến chữ U ngược, với một điểm turning point tối ưu trước khi chi phí điều phối và bất định vượt qua lợi ích từ mở rộng thị trường quốc tế. Cơ sở lý thuyết trực tiếp bao gồm mô hình S-curve của Lu và Beamish (2004), lý thuyết ba giai đoạn của Contractor et al. (2003), và bằng chứng inverted-U ban đầu của Hitt et al. (1997).</w:t>
+        <w:t xml:space="preserve">Trên cơ sở lý thuyết từ Uppsala về chi phí thâm nhập giai đoạn đầu, RBV về lợi thế cạnh tranh tích lũy ở giai đoạn trung, và lý thuyết chi phí giao dịch về sự phức tạp điều phối ở giai đoạn mở rộng quá mức, giả thuyết H1 được phát biểu như sau. Quan hệ giữa mức độ quốc tế hóa và hiệu quả hoạt động của các doanh nghiệp ở các quốc gia châu Á có dạng phi tuyến chữ U ngược, với một điểm turning point tối ưu trước khi chi phí điều phối và bất định vượt qua lợi ích từ mở rộng thị trường quốc tế. Cơ sở lý thuyết trực tiếp bao gồm mô hình S-curve của Lu và Beamish (2004), lý thuyết ba giai đoạn của Contractor et al. (2003), và bằng chứng inverted-U ban đầu của Hitt et al. (1997).</w:t>
       </w:r>
     </w:p>
     <w:bookmarkEnd w:id="41"/>
-    <w:bookmarkStart w:id="42" w:name="Xdbf0ae64633523b25c46a68390b7cec268e3e1b"/>
+    <w:bookmarkStart w:id="42" w:name="X1e4f3f6a2f993a9a6e6b8e711bb6f577a973378"/>
     <w:p>
       <w:pPr>
         <w:pStyle w:val="Heading3"/>
@@ -870,7 +1148,7 @@
       </w:r>
     </w:p>
     <w:bookmarkEnd w:id="42"/>
-    <w:bookmarkStart w:id="43" w:name="Xbab760a32cde05e137045bc8f7a3707f43bde01"/>
+    <w:bookmarkStart w:id="43" w:name="X4e283c765855921a9a0bf70a9d0a980f4bd502f"/>
     <w:p>
       <w:pPr>
         <w:pStyle w:val="Heading3"/>
@@ -884,11 +1162,11 @@
         <w:pStyle w:val="FirstParagraph"/>
       </w:pPr>
       <w:r>
-        <w:t xml:space="preserve">Dựa trên RBV (Barney, 1991) và lý thuyết năng lực động (Teece et al., 1997), năng lực công nghệ là một nguồn lực VRIN giúp doanh nghiệp khai thác lợi ích từ quốc tế hóa hiệu quả hơn. Giả thuyết H2 được phát biểu như sau. Năng lực công nghệ (TCI) làm gia tăng tác động tích cực của quốc tế hóa lên hiệu quả hoạt động của doanh nghiệp, bằng cách nâng mặt bằng hiệu quả tổng thể và làm giảm chi phí học hỏi thị trường quốc tế, do đó làm dịch chuyển đường quan hệ I–P lên cao hơn và có thể điều chỉnh vị trí của điểm turning point. Cơ sở lý thuyết bao gồm Barney (1991), Teece et al. (1997), và Bhandari et al. (2023).</w:t>
+        <w:t xml:space="preserve">Dựa trên RBV (Barney, 1991) và lý thuyết năng lực động (Teece et al., 1997), năng lực công nghệ là một nguồn lực VRIN giúp doanh nghiệp khai thác lợi ích từ quốc tế hóa hiệu quả hơn. Giả thuyết H2 được phát biểu như sau. Năng lực công nghệ (TCI) làm gia tăng tác động tích cực của quốc tế hóa lên hiệu quả hoạt động của doanh nghiệp, bằng cách nâng mặt bằng hiệu quả tổng thể và làm giảm chi phí học hỏi thị trường quốc tế, do đó làm dịch chuyển đường quan hệ I–P lên cao hơn và có thể điều chỉnh vị trí của điểm turning point. Cơ sở lý thuyết bao gồm Barney (1991), Teece et al. (1997), và Bhandari et al. (2023).</w:t>
       </w:r>
     </w:p>
     <w:bookmarkEnd w:id="43"/>
-    <w:bookmarkStart w:id="44" w:name="Xe02c8b4badca737e34d9828c14f576073ebfca3"/>
+    <w:bookmarkStart w:id="44" w:name="X128abf7a15253174c605d07067219580799d526"/>
     <w:p>
       <w:pPr>
         <w:pStyle w:val="Heading3"/>
@@ -902,11 +1180,11 @@
         <w:pStyle w:val="FirstParagraph"/>
       </w:pPr>
       <w:r>
-        <w:t xml:space="preserve">Phân biệt rõ với H2, DAI không có chiều sâu năng lực tổ chức như TCI nhưng có vai trò giảm thiểu chi phí phối hợp xuyên biên giới ở mức xuất khẩu cao. Giả thuyết H3 được phát biểu như sau. Chỉ số chấp nhận số (DAI) điều tiết mối quan hệ I–P, với vai trò bổ trợ rõ rệt hơn ở mức export intensity cao khi DAI giúp giảm chi phí phối hợp giao dịch xuyên biên giới — theo đó DAI làm thay đổi độ dốc của đường quan hệ I–P chứ không nhất thiết nâng mặt bằng hiệu quả như TCI. Cơ sở lý thuyết bao gồm Verhoef et al. (2021), Stallkamp và Schotter (2021), và Bustamante et al. (2022). Sự phân biệt cơ chế tác động giữa H2 và H3 là đóng góp lý thuyết quan trọng, cho phép phân tách TCI và DAI trong mô hình hồi quy thực nghiệm.</w:t>
+        <w:t xml:space="preserve">Phân biệt rõ với H2, DAI không có chiều sâu năng lực tổ chức như TCI nhưng có vai trò giảm thiểu chi phí phối hợp xuyên biên giới ở mức xuất khẩu cao. Giả thuyết H3 được phát biểu như sau. Chỉ số chấp nhận số (DAI) điều tiết mối quan hệ I–P, với vai trò bổ trợ rõ rệt hơn ở mức export intensity cao khi DAI giúp giảm chi phí phối hợp giao dịch xuyên biên giới — theo đó DAI làm thay đổi độ dốc của đường quan hệ I–P chứ không nhất thiết nâng mặt bằng hiệu quả như TCI. Cơ sở lý thuyết bao gồm Verhoef et al. (2021), Stallkamp và Schotter (2021), và Bustamante et al. (2022). Sự phân biệt cơ chế tác động giữa H2 và H3 là đóng góp lý thuyết quan trọng, cho phép phân tách TCI và DAI trong mô hình hồi quy thực nghiệm.</w:t>
       </w:r>
     </w:p>
     <w:bookmarkEnd w:id="44"/>
-    <w:bookmarkStart w:id="45" w:name="Xf3c96f7a7f1c969bc60bd7349590849b049c32c"/>
+    <w:bookmarkStart w:id="45" w:name="X23e235aa1540adf65664378accbc0b6a13fdffd"/>
     <w:p>
       <w:pPr>
         <w:pStyle w:val="Heading3"/>
@@ -920,11 +1198,11 @@
         <w:pStyle w:val="FirstParagraph"/>
       </w:pPr>
       <w:r>
-        <w:t xml:space="preserve">Dựa trên Upper Echelons Theory (Hambrick &amp; Mason, 1984; Hambrick, 2007), quyết định chiến lược quốc tế hóa và khả năng chuyển hóa nó thành hiệu quả phụ thuộc vào đặc điểm nhận thức và kinh nghiệm của nhà quản trị. Giả thuyết H4 được phát biểu như sau. Kinh nghiệm quản trị và giới tính nữ của nhà quản trị cấp cao làm mạnh hơn tác động tích cực của quốc tế hóa lên hiệu quả hoạt động, thông qua cơ chế nâng cao nhận thức chiến lược quốc tế và quản trị rủi ro thận trọng hơn trong quá trình mở rộng quốc tế. Cơ sở lý thuyết bao gồm Hambrick và Mason (1984), Hsu et al. (2013), và Post và Byron (2015); bằng chứng thực nghiệm ở cấp doanh nghiệp cho thấy kinh nghiệm và giới tính của nhà quản trị có thể điều tiết quan hệ quốc tế hóa–hiệu quả (Phan, Do, &amp; Phan, 2020; Phan et al., 2021; Do &amp; Phan, 2025).</w:t>
+        <w:t xml:space="preserve">Dựa trên Upper Echelons Theory (Hambrick &amp; Mason, 1984; Hambrick, 2007), quyết định chiến lược quốc tế hóa và khả năng chuyển hóa nó thành hiệu quả phụ thuộc vào đặc điểm nhận thức và kinh nghiệm của nhà quản trị. Giả thuyết H4 được phát biểu như sau. Kinh nghiệm quản trị và giới tính nữ của nhà quản trị cấp cao làm mạnh hơn tác động tích cực của quốc tế hóa lên hiệu quả hoạt động, thông qua cơ chế nâng cao nhận thức chiến lược quốc tế và quản trị rủi ro thận trọng hơn trong quá trình mở rộng quốc tế. Cơ sở lý thuyết bao gồm Hambrick và Mason (1984), Hsu et al. (2013), và Post và Byron (2015); bằng chứng thực nghiệm ở cấp doanh nghiệp cho thấy kinh nghiệm và giới tính của nhà quản trị có thể điều tiết quan hệ quốc tế hóa–hiệu quả (Phan, Do, &amp; Phan, 2020; Phan et al., 2021; Do &amp; Phan, 2025).</w:t>
       </w:r>
     </w:p>
     <w:bookmarkEnd w:id="45"/>
-    <w:bookmarkStart w:id="46" w:name="X6cb624958e89d2dec9f57563abada44477d846d"/>
+    <w:bookmarkStart w:id="46" w:name="X1090b4891c9abf48d7aab0f24d22e9d66d1b02d"/>
     <w:p>
       <w:pPr>
         <w:pStyle w:val="Heading3"/>
@@ -938,11 +1216,29 @@
         <w:pStyle w:val="FirstParagraph"/>
       </w:pPr>
       <w:r>
-        <w:t xml:space="preserve">Trên cơ sở Institutional Theory (North, 1990; Khanna &amp; Palepu, 2010), chất lượng thể chế tạo ra chi phí giao dịch và rủi ro khác nhau, do đó điều tiết đáng kể mối quan hệ I–P. Giả thuyết H5 được phát biểu như sau. Chất lượng thể chế theo khung ICRV điều tiết tác động của các rào cản thể chế (institutional obstacles) lên hiệu quả hoạt động trong quá trình quốc tế hóa, với chỉ số chấp nhận số (DAI) đóng vai trò "lá chắn số" (digital shield) giúp bù đắp một phần khoảng trống thể chế; cường độ điều tiết này giảm dần theo gradient ICRV từ các nền kinh tế frontier (Nhóm V–VI, điều tiết mạnh nhất) đến các nền kinh tế tiên tiến (Nhóm I, điều tiết yếu nhất). Cơ sở lý thuyết bao gồm North (1990), Khanna và Palepu (2010), và Marano et al. (2016).</w:t>
+        <w:t xml:space="preserve">Trên cơ sở Institutional Theory (North, 1990; Khanna &amp; Palepu, 2010), chất lượng thể chế tạo ra chi phí giao dịch và rủi ro khác nhau, do đó điều tiết đáng kể mối quan hệ I–P. Giả thuyết H5 được phát biểu như sau. Chất lượng thể chế theo khung ICRV điều tiết tác động của các rào cản thể chế (institutional obstacles) lên hiệu quả hoạt động trong quá trình quốc tế hóa, với chỉ số chấp nhận số (DAI) đóng vai trò</w:t>
+      </w:r>
+      <w:r>
+        <w:t xml:space="preserve"> </w:t>
+      </w:r>
+      <w:r>
+        <w:t xml:space="preserve">“</w:t>
+      </w:r>
+      <w:r>
+        <w:t xml:space="preserve">lá chắn số</w:t>
+      </w:r>
+      <w:r>
+        <w:t xml:space="preserve">”</w:t>
+      </w:r>
+      <w:r>
+        <w:t xml:space="preserve"> </w:t>
+      </w:r>
+      <w:r>
+        <w:t xml:space="preserve">(digital shield) giúp bù đắp một phần khoảng trống thể chế; cường độ điều tiết này giảm dần theo gradient ICRV từ các nền kinh tế frontier (Nhóm V–VI, điều tiết mạnh nhất) đến các nền kinh tế tiên tiến (Nhóm I, điều tiết yếu nhất). Cơ sở lý thuyết bao gồm North (1990), Khanna và Palepu (2010), và Marano et al. (2016).</w:t>
       </w:r>
     </w:p>
     <w:bookmarkEnd w:id="46"/>
-    <w:bookmarkStart w:id="47" w:name="X61cc752874ba7b59207724628dc012c7fefbefb"/>
+    <w:bookmarkStart w:id="47" w:name="Xef57ba07d4a873fdbd0fe03fe237e0edc9cc461"/>
     <w:p>
       <w:pPr>
         <w:pStyle w:val="Heading3"/>
@@ -956,7 +1252,7 @@
         <w:pStyle w:val="FirstParagraph"/>
       </w:pPr>
       <w:r>
-        <w:t xml:space="preserve">Dựa trên quan sát về tốc độ chuyển đổi số và thay đổi thể chế rất nhanh ở một số nền kinh tế châu Á, đặc biệt Trung Quốc, quan hệ I–P không nhất thiết ổn định theo thời gian. Giả thuyết H6 được phát biểu như sau. Hình dạng phi tuyến của quan hệ I–P — cụ thể là vị trí của điểm turning point và độ cong của đường quan hệ — thay đổi theo thời gian trong các nền kinh tế chuyển đổi nhanh, phản ánh sự phát triển của năng lực doanh nghiệp và cải thiện điều kiện thể chế qua các giai đoạn. Cơ sở lý thuyết bao gồm Wu et al. (2022), Xiao et al. (2013), và Banalieva và Dhanaraj (2019). Bằng chứng từ nghiên cứu thành phần P2 về sự ổn định tương đối của turning point Trung Quốc giữa 2012 và 2024 (Paternoster z = +0,82, p = .412, không bác bỏ bằng nhau) cung cấp cơ sở thực nghiệm bổ sung cho việc kiểm định H6 ở cấp độ luận án.</w:t>
+        <w:t xml:space="preserve">Dựa trên quan sát về tốc độ chuyển đổi số và thay đổi thể chế rất nhanh ở một số nền kinh tế châu Á, đặc biệt Trung Quốc, quan hệ I–P không nhất thiết ổn định theo thời gian. Giả thuyết H6 được phát biểu như sau. Hình dạng phi tuyến của quan hệ I–P — cụ thể là vị trí của điểm turning point và độ cong của đường quan hệ — thay đổi theo thời gian trong các nền kinh tế chuyển đổi nhanh, phản ánh sự phát triển của năng lực doanh nghiệp và cải thiện điều kiện thể chế qua các giai đoạn. Cơ sở lý thuyết bao gồm Wu et al. (2022), Xiao et al. (2013), và Banalieva và Dhanaraj (2019). Bằng chứng từ nghiên cứu thành phần P2 về sự ổn định tương đối của turning point Trung Quốc giữa 2012 và 2024 (Paternoster z = +0,82, p = .412, không bác bỏ bằng nhau) cung cấp cơ sở thực nghiệm bổ sung cho việc kiểm định H6 ở cấp độ luận án.</w:t>
       </w:r>
     </w:p>
     <w:p>
@@ -967,7 +1263,7 @@
       </w:r>
     </w:p>
     <w:bookmarkEnd w:id="47"/>
-    <w:bookmarkStart w:id="48" w:name="Xe7d8e87fd4c6817ebf83bfc9a906e5cc228db6c"/>
+    <w:bookmarkStart w:id="48" w:name="Xf335a697a9ee7a16b4b110396196a58c357e907"/>
     <w:p>
       <w:pPr>
         <w:pStyle w:val="Heading3"/>
@@ -1009,7 +1305,7 @@
     <w:tbl>
       <w:tblPr>
         <w:tblStyle w:val="Table"/>
-        <w:tblW w:type="auto" w:w="0"/>
+        <w:tblW w:type="pct" w:w="5000"/>
         <w:tblLook w:firstRow="1" w:lastRow="0" w:firstColumn="0" w:lastColumn="0" w:noHBand="0" w:noVBand="0" w:val="0020"/>
         <w:jc w:val="start"/>
       </w:tblPr>
@@ -1381,7 +1677,7 @@
               <w:jc w:val="left"/>
             </w:pPr>
             <w:r>
-              <w:t xml:space="preserve">P8 — SIDS (9 nền kinh tế, Nhóm VI)</w:t>
+              <w:t xml:space="preserve">P8 — Pacific SIDS (mẫu chính 7 nước, N=959; kiểm định độ vững mở rộng 9 nước Nhóm VI)</w:t>
             </w:r>
           </w:p>
         </w:tc>
@@ -1437,7 +1733,7 @@
     </w:p>
     <w:bookmarkEnd w:id="48"/>
     <w:bookmarkEnd w:id="49"/>
-    <w:bookmarkStart w:id="50" w:name="X80aaa8b1e91108605e0ad5aa38ac8f05a046a38"/>
+    <w:bookmarkStart w:id="50" w:name="tóm-tắt-chương"/>
     <w:p>
       <w:pPr>
         <w:pStyle w:val="Heading2"/>
@@ -1480,10 +1776,7 @@
     </w:p>
     <w:bookmarkEnd w:id="50"/>
     <w:bookmarkEnd w:id="51"/>
-    <w:sectPr>
-      <w:pgSz w:h="16838" w:w="11906"/>
-      <w:pgMar w:bottom="1134" w:left="1701" w:right="1134" w:top="1134"/>
-    </w:sectPr>
+    <w:sectPr/>
   </w:body>
 </w:document>
 </file>
@@ -1616,59 +1909,29 @@
   <w:style w:default="1" w:styleId="Normal" w:type="paragraph">
     <w:name w:val="Normal"/>
     <w:qFormat/>
-    <w:pPr>
-      <w:spacing w:line="360" w:lineRule="auto"/>
-      <w:jc w:val="both"/>
-    </w:pPr>
-    <w:rPr>
-      <w:rFonts w:ascii="Times New Roman" w:eastAsia="Times New Roman" w:hAnsi="Times New Roman"/>
-      <w:color w:val="000000"/>
-      <w:sz w:val="26"/>
-    </w:rPr>
   </w:style>
   <w:style w:styleId="BodyText" w:type="paragraph">
     <w:name w:val="Body Text"/>
     <w:basedOn w:val="Normal"/>
     <w:link w:val="BodyTextChar"/>
     <w:pPr>
-      <w:spacing w:after="180" w:before="180" w:line="360" w:lineRule="auto"/>
-      <w:jc w:val="both"/>
+      <w:spacing w:after="180" w:before="180"/>
     </w:pPr>
     <w:qFormat/>
-    <w:rPr>
-      <w:rFonts w:ascii="Times New Roman" w:eastAsia="Times New Roman" w:hAnsi="Times New Roman"/>
-      <w:color w:val="000000"/>
-      <w:sz w:val="26"/>
-    </w:rPr>
   </w:style>
   <w:style w:customStyle="1" w:styleId="FirstParagraph" w:type="paragraph">
     <w:name w:val="First Paragraph"/>
     <w:basedOn w:val="BodyText"/>
     <w:next w:val="BodyText"/>
     <w:qFormat/>
-    <w:pPr>
-      <w:spacing w:line="360" w:lineRule="auto"/>
-      <w:jc w:val="both"/>
-    </w:pPr>
-    <w:rPr>
-      <w:rFonts w:ascii="Times New Roman" w:eastAsia="Times New Roman" w:hAnsi="Times New Roman"/>
-      <w:color w:val="000000"/>
-      <w:sz w:val="26"/>
-    </w:rPr>
   </w:style>
   <w:style w:customStyle="1" w:styleId="Compact" w:type="paragraph">
     <w:name w:val="Compact"/>
     <w:basedOn w:val="BodyText"/>
     <w:qFormat/>
     <w:pPr>
-      <w:spacing w:after="36" w:before="36" w:line="360" w:lineRule="auto"/>
-      <w:jc w:val="both"/>
+      <w:spacing w:after="36" w:before="36"/>
     </w:pPr>
-    <w:rPr>
-      <w:rFonts w:ascii="Times New Roman" w:eastAsia="Times New Roman" w:hAnsi="Times New Roman"/>
-      <w:color w:val="000000"/>
-      <w:sz w:val="26"/>
-    </w:rPr>
   </w:style>
   <w:style w:styleId="Title" w:type="paragraph">
     <w:name w:val="Title"/>
@@ -1678,15 +1941,15 @@
     <w:pPr>
       <w:keepNext/>
       <w:keepLines/>
-      <w:spacing w:after="240" w:before="480" w:line="360" w:lineRule="auto"/>
-      <w:jc w:val="both"/>
+      <w:spacing w:after="240" w:before="480"/>
+      <w:jc w:val="center"/>
     </w:pPr>
     <w:rPr>
-      <w:rFonts w:ascii="Times New Roman" w:asciiTheme="majorHAnsi" w:cstheme="majorBidi" w:eastAsia="Times New Roman" w:eastAsiaTheme="majorEastAsia" w:hAnsi="Times New Roman" w:hAnsiTheme="majorHAnsi"/>
+      <w:rFonts w:asciiTheme="majorHAnsi" w:cstheme="majorBidi" w:eastAsiaTheme="majorEastAsia" w:hAnsiTheme="majorHAnsi"/>
       <w:b/>
       <w:bCs/>
-      <w:color w:val="000000"/>
-      <w:sz w:val="26"/>
+      <w:color w:themeColor="accent1" w:themeShade="B5" w:val="345A8A"/>
+      <w:sz w:val="36"/>
       <w:szCs w:val="36"/>
     </w:rPr>
   </w:style>
@@ -1698,13 +1961,11 @@
     <w:pPr>
       <w:keepNext/>
       <w:keepLines/>
-      <w:spacing w:after="240" w:before="240" w:line="360" w:lineRule="auto"/>
-      <w:jc w:val="both"/>
+      <w:spacing w:after="240" w:before="240"/>
+      <w:jc w:val="center"/>
     </w:pPr>
     <w:rPr>
-      <w:rFonts w:ascii="Times New Roman" w:eastAsia="Times New Roman" w:hAnsi="Times New Roman"/>
-      <w:color w:val="000000"/>
-      <w:sz w:val="26"/>
+      <w:sz w:val="30"/>
       <w:szCs w:val="30"/>
     </w:rPr>
   </w:style>
@@ -1715,14 +1976,8 @@
     <w:pPr>
       <w:keepNext/>
       <w:keepLines/>
-      <w:spacing w:line="360" w:lineRule="auto"/>
-      <w:jc w:val="both"/>
+      <w:jc w:val="center"/>
     </w:pPr>
-    <w:rPr>
-      <w:rFonts w:ascii="Times New Roman" w:eastAsia="Times New Roman" w:hAnsi="Times New Roman"/>
-      <w:color w:val="000000"/>
-      <w:sz w:val="26"/>
-    </w:rPr>
   </w:style>
   <w:style w:styleId="Date" w:type="paragraph">
     <w:name w:val="Date"/>
@@ -1731,14 +1986,8 @@
     <w:pPr>
       <w:keepNext/>
       <w:keepLines/>
-      <w:spacing w:line="360" w:lineRule="auto"/>
-      <w:jc w:val="both"/>
+      <w:jc w:val="center"/>
     </w:pPr>
-    <w:rPr>
-      <w:rFonts w:ascii="Times New Roman" w:eastAsia="Times New Roman" w:hAnsi="Times New Roman"/>
-      <w:color w:val="000000"/>
-      <w:sz w:val="26"/>
-    </w:rPr>
   </w:style>
   <w:style w:customStyle="1" w:styleId="AbstractTitle" w:type="paragraph">
     <w:name w:val="Abstract Title"/>
@@ -1748,15 +1997,15 @@
     <w:pPr>
       <w:keepNext/>
       <w:keepLines/>
-      <w:jc w:val="both"/>
-      <w:spacing w:after="0" w:before="300" w:line="360" w:lineRule="auto"/>
+      <w:jc w:val="center"/>
+      <w:spacing w:after="0" w:before="300"/>
     </w:pPr>
     <w:rPr>
-      <w:color w:val="000000"/>
-      <w:sz w:val="26"/>
+      <w:sz w:val="20"/>
       <w:szCs w:val="20"/>
-      <w:rFonts w:ascii="Times New Roman" w:eastAsia="Times New Roman" w:hAnsi="Times New Roman"/>
       <w:b/>
+      <w:color w:val="345A8A"/>
+      &gt;
     </w:rPr>
   </w:style>
   <w:style w:customStyle="1" w:styleId="Abstract" w:type="paragraph">
@@ -1767,13 +2016,10 @@
     <w:pPr>
       <w:keepNext/>
       <w:keepLines/>
-      <w:spacing w:after="300" w:before="100" w:line="360" w:lineRule="auto"/>
-      <w:jc w:val="both"/>
+      <w:spacing w:after="300" w:before="100"/>
     </w:pPr>
     <w:rPr>
-      <w:rFonts w:ascii="Times New Roman" w:eastAsia="Times New Roman" w:hAnsi="Times New Roman"/>
-      <w:color w:val="000000"/>
-      <w:sz w:val="26"/>
+      <w:sz w:val="20"/>
       <w:szCs w:val="20"/>
     </w:rPr>
   </w:style>
@@ -1782,15 +2028,8 @@
     <w:basedOn w:val="Normal"/>
     <w:next w:val="Bibliography"/>
     <w:qFormat/>
-    <w:pPr>
-      <w:spacing w:line="360" w:lineRule="auto"/>
-      <w:jc w:val="both"/>
-    </w:pPr>
-    <w:rPr>
-      <w:rFonts w:ascii="Times New Roman" w:eastAsia="Times New Roman" w:hAnsi="Times New Roman"/>
-      <w:color w:val="000000"/>
-      <w:sz w:val="26"/>
-    </w:rPr>
+    <w:pPr/>
+    <w:rPr/>
   </w:style>
   <w:style w:styleId="Heading1" w:type="paragraph">
     <w:name w:val="Heading 1"/>
@@ -1801,16 +2040,15 @@
     <w:pPr>
       <w:keepNext/>
       <w:keepLines/>
-      <w:spacing w:after="0" w:before="480" w:line="360" w:lineRule="auto"/>
-      <w:jc w:val="both"/>
+      <w:spacing w:after="0" w:before="480"/>
       <w:outlineLvl w:val="0"/>
     </w:pPr>
     <w:rPr>
-      <w:rFonts w:ascii="Times New Roman" w:asciiTheme="majorHAnsi" w:cstheme="majorBidi" w:eastAsia="Times New Roman" w:eastAsiaTheme="majorEastAsia" w:hAnsi="Times New Roman" w:hAnsiTheme="majorHAnsi"/>
+      <w:rFonts w:asciiTheme="majorHAnsi" w:cstheme="majorBidi" w:eastAsiaTheme="majorEastAsia" w:hAnsiTheme="majorHAnsi"/>
       <w:b/>
       <w:bCs/>
-      <w:color w:val="000000"/>
-      <w:sz w:val="26"/>
+      <w:color w:themeColor="accent1" w:val="4F81BD"/>
+      <w:sz w:val="32"/>
       <w:szCs w:val="32"/>
     </w:rPr>
   </w:style>
@@ -1824,16 +2062,15 @@
     <w:pPr>
       <w:keepNext/>
       <w:keepLines/>
-      <w:spacing w:after="0" w:before="200" w:line="360" w:lineRule="auto"/>
-      <w:jc w:val="both"/>
+      <w:spacing w:after="0" w:before="200"/>
       <w:outlineLvl w:val="1"/>
     </w:pPr>
     <w:rPr>
-      <w:rFonts w:ascii="Times New Roman" w:asciiTheme="majorHAnsi" w:cstheme="majorBidi" w:eastAsia="Times New Roman" w:eastAsiaTheme="majorEastAsia" w:hAnsi="Times New Roman" w:hAnsiTheme="majorHAnsi"/>
+      <w:rFonts w:asciiTheme="majorHAnsi" w:cstheme="majorBidi" w:eastAsiaTheme="majorEastAsia" w:hAnsiTheme="majorHAnsi"/>
       <w:b/>
       <w:bCs/>
-      <w:color w:val="000000"/>
-      <w:sz w:val="26"/>
+      <w:color w:themeColor="accent1" w:val="4F81BD"/>
+      <w:sz w:val="28"/>
       <w:szCs w:val="28"/>
     </w:rPr>
   </w:style>
@@ -1847,16 +2084,15 @@
     <w:pPr>
       <w:keepNext/>
       <w:keepLines/>
-      <w:spacing w:after="0" w:before="200" w:line="360" w:lineRule="auto"/>
-      <w:jc w:val="both"/>
+      <w:spacing w:after="0" w:before="200"/>
       <w:outlineLvl w:val="2"/>
     </w:pPr>
     <w:rPr>
-      <w:rFonts w:ascii="Times New Roman" w:asciiTheme="majorHAnsi" w:cstheme="majorBidi" w:eastAsia="Times New Roman" w:eastAsiaTheme="majorEastAsia" w:hAnsi="Times New Roman" w:hAnsiTheme="majorHAnsi"/>
+      <w:rFonts w:asciiTheme="majorHAnsi" w:cstheme="majorBidi" w:eastAsiaTheme="majorEastAsia" w:hAnsiTheme="majorHAnsi"/>
       <w:b/>
       <w:bCs/>
-      <w:color w:val="000000"/>
-      <w:sz w:val="26"/>
+      <w:color w:themeColor="accent1" w:val="4F81BD"/>
+      <w:sz w:val="24"/>
       <w:szCs w:val="24"/>
     </w:rPr>
   </w:style>
@@ -1870,16 +2106,15 @@
     <w:pPr>
       <w:keepNext/>
       <w:keepLines/>
-      <w:spacing w:after="0" w:before="200" w:line="360" w:lineRule="auto"/>
-      <w:jc w:val="both"/>
+      <w:spacing w:after="0" w:before="200"/>
       <w:outlineLvl w:val="3"/>
     </w:pPr>
     <w:rPr>
-      <w:rFonts w:ascii="Times New Roman" w:asciiTheme="majorHAnsi" w:cstheme="majorBidi" w:eastAsia="Times New Roman" w:eastAsiaTheme="majorEastAsia" w:hAnsi="Times New Roman" w:hAnsiTheme="majorHAnsi"/>
+      <w:rFonts w:asciiTheme="majorHAnsi" w:cstheme="majorBidi" w:eastAsiaTheme="majorEastAsia" w:hAnsiTheme="majorHAnsi"/>
       <w:i/>
       <w:bCs/>
-      <w:color w:val="000000"/>
-      <w:sz w:val="26"/>
+      <w:color w:themeColor="accent1" w:val="4F81BD"/>
+      <w:sz w:val="24"/>
       <w:szCs w:val="24"/>
     </w:rPr>
   </w:style>
@@ -1893,15 +2128,14 @@
     <w:pPr>
       <w:keepNext/>
       <w:keepLines/>
-      <w:spacing w:after="0" w:before="200" w:line="360" w:lineRule="auto"/>
-      <w:jc w:val="both"/>
+      <w:spacing w:after="0" w:before="200"/>
       <w:outlineLvl w:val="4"/>
     </w:pPr>
     <w:rPr>
-      <w:rFonts w:ascii="Times New Roman" w:asciiTheme="majorHAnsi" w:cstheme="majorBidi" w:eastAsia="Times New Roman" w:eastAsiaTheme="majorEastAsia" w:hAnsi="Times New Roman" w:hAnsiTheme="majorHAnsi"/>
+      <w:rFonts w:asciiTheme="majorHAnsi" w:cstheme="majorBidi" w:eastAsiaTheme="majorEastAsia" w:hAnsiTheme="majorHAnsi"/>
       <w:iCs/>
-      <w:color w:val="000000"/>
-      <w:sz w:val="26"/>
+      <w:color w:themeColor="accent1" w:val="4F81BD"/>
+      <w:sz w:val="24"/>
       <w:szCs w:val="24"/>
     </w:rPr>
   </w:style>
@@ -1915,14 +2149,13 @@
     <w:pPr>
       <w:keepNext/>
       <w:keepLines/>
-      <w:spacing w:after="0" w:before="200" w:line="360" w:lineRule="auto"/>
-      <w:jc w:val="both"/>
+      <w:spacing w:after="0" w:before="200"/>
       <w:outlineLvl w:val="5"/>
     </w:pPr>
     <w:rPr>
-      <w:rFonts w:ascii="Times New Roman" w:asciiTheme="majorHAnsi" w:cstheme="majorBidi" w:eastAsia="Times New Roman" w:eastAsiaTheme="majorEastAsia" w:hAnsi="Times New Roman" w:hAnsiTheme="majorHAnsi"/>
-      <w:color w:val="000000"/>
-      <w:sz w:val="26"/>
+      <w:rFonts w:asciiTheme="majorHAnsi" w:cstheme="majorBidi" w:eastAsiaTheme="majorEastAsia" w:hAnsiTheme="majorHAnsi"/>
+      <w:color w:themeColor="accent1" w:val="4F81BD"/>
+      <w:sz w:val="24"/>
       <w:szCs w:val="24"/>
     </w:rPr>
   </w:style>
@@ -1936,14 +2169,13 @@
     <w:pPr>
       <w:keepNext/>
       <w:keepLines/>
-      <w:spacing w:after="0" w:before="200" w:line="360" w:lineRule="auto"/>
-      <w:jc w:val="both"/>
+      <w:spacing w:after="0" w:before="200"/>
       <w:outlineLvl w:val="6"/>
     </w:pPr>
     <w:rPr>
-      <w:rFonts w:ascii="Times New Roman" w:asciiTheme="majorHAnsi" w:cstheme="majorBidi" w:eastAsia="Times New Roman" w:eastAsiaTheme="majorEastAsia" w:hAnsi="Times New Roman" w:hAnsiTheme="majorHAnsi"/>
-      <w:color w:val="000000"/>
-      <w:sz w:val="26"/>
+      <w:rFonts w:asciiTheme="majorHAnsi" w:cstheme="majorBidi" w:eastAsiaTheme="majorEastAsia" w:hAnsiTheme="majorHAnsi"/>
+      <w:color w:themeColor="accent1" w:val="4F81BD"/>
+      <w:sz w:val="24"/>
       <w:szCs w:val="24"/>
     </w:rPr>
   </w:style>
@@ -1957,14 +2189,13 @@
     <w:pPr>
       <w:keepNext/>
       <w:keepLines/>
-      <w:spacing w:after="0" w:before="200" w:line="360" w:lineRule="auto"/>
-      <w:jc w:val="both"/>
+      <w:spacing w:after="0" w:before="200"/>
       <w:outlineLvl w:val="7"/>
     </w:pPr>
     <w:rPr>
-      <w:rFonts w:ascii="Times New Roman" w:asciiTheme="majorHAnsi" w:cstheme="majorBidi" w:eastAsia="Times New Roman" w:eastAsiaTheme="majorEastAsia" w:hAnsi="Times New Roman" w:hAnsiTheme="majorHAnsi"/>
-      <w:color w:val="000000"/>
-      <w:sz w:val="26"/>
+      <w:rFonts w:asciiTheme="majorHAnsi" w:cstheme="majorBidi" w:eastAsiaTheme="majorEastAsia" w:hAnsiTheme="majorHAnsi"/>
+      <w:color w:themeColor="accent1" w:val="4F81BD"/>
+      <w:sz w:val="24"/>
       <w:szCs w:val="24"/>
     </w:rPr>
   </w:style>
@@ -1978,14 +2209,13 @@
     <w:pPr>
       <w:keepNext/>
       <w:keepLines/>
-      <w:spacing w:after="0" w:before="200" w:line="360" w:lineRule="auto"/>
-      <w:jc w:val="both"/>
+      <w:spacing w:after="0" w:before="200"/>
       <w:outlineLvl w:val="8"/>
     </w:pPr>
     <w:rPr>
-      <w:rFonts w:ascii="Times New Roman" w:asciiTheme="majorHAnsi" w:cstheme="majorBidi" w:eastAsia="Times New Roman" w:eastAsiaTheme="majorEastAsia" w:hAnsi="Times New Roman" w:hAnsiTheme="majorHAnsi"/>
-      <w:color w:val="000000"/>
-      <w:sz w:val="26"/>
+      <w:rFonts w:asciiTheme="majorHAnsi" w:cstheme="majorBidi" w:eastAsiaTheme="majorEastAsia" w:hAnsiTheme="majorHAnsi"/>
+      <w:color w:themeColor="accent1" w:val="4F81BD"/>
+      <w:sz w:val="24"/>
       <w:szCs w:val="24"/>
     </w:rPr>
   </w:style>
@@ -1997,15 +2227,9 @@
     <w:unhideWhenUsed/>
     <w:qFormat/>
     <w:pPr>
-      <w:spacing w:after="100" w:before="100" w:line="360" w:lineRule="auto"/>
+      <w:spacing w:after="100" w:before="100"/>
       <w:ind w:firstLine="0" w:left="480" w:right="480"/>
-      <w:jc w:val="both"/>
     </w:pPr>
-    <w:rPr>
-      <w:rFonts w:ascii="Times New Roman" w:eastAsia="Times New Roman" w:hAnsi="Times New Roman"/>
-      <w:color w:val="000000"/>
-      <w:sz w:val="26"/>
-    </w:rPr>
   </w:style>
   <w:style w:styleId="FootnoteText" w:type="paragraph">
     <w:name w:val="Footnote Text"/>
@@ -2014,25 +2238,11 @@
     <w:uiPriority w:val="9"/>
     <w:unhideWhenUsed/>
     <w:qFormat/>
-    <w:pPr>
-      <w:spacing w:line="360" w:lineRule="auto"/>
-      <w:jc w:val="both"/>
-    </w:pPr>
-    <w:rPr>
-      <w:rFonts w:ascii="Times New Roman" w:eastAsia="Times New Roman" w:hAnsi="Times New Roman"/>
-      <w:color w:val="000000"/>
-      <w:sz w:val="26"/>
-    </w:rPr>
   </w:style>
   <w:style w:default="1" w:styleId="DefaultParagraphFont" w:type="character">
     <w:name w:val="Default Paragraph Font"/>
     <w:semiHidden/>
     <w:unhideWhenUsed/>
-    <w:rPr>
-      <w:rFonts w:ascii="Times New Roman" w:eastAsia="Times New Roman" w:hAnsi="Times New Roman"/>
-      <w:color w:val="000000"/>
-      <w:sz w:val="26"/>
-    </w:rPr>
   </w:style>
   <w:style w:default="1" w:styleId="Table" w:type="table">
     <w:name w:val="Table"/>
@@ -2040,15 +2250,6 @@
     <w:semiHidden/>
     <w:unhideWhenUsed/>
     <w:qFormat/>
-    <w:pPr>
-      <w:spacing w:line="360" w:lineRule="auto"/>
-      <w:jc w:val="both"/>
-    </w:pPr>
-    <w:rPr>
-      <w:rFonts w:ascii="Times New Roman" w:eastAsia="Times New Roman" w:hAnsi="Times New Roman"/>
-      <w:color w:val="000000"/>
-      <w:sz w:val="26"/>
-    </w:rPr>
     <w:tblPr>
       <w:tblInd w:type="dxa" w:w="0"/>
       <w:tblCellMar>
@@ -2081,42 +2282,25 @@
     <w:pPr>
       <w:keepNext/>
       <w:keepLines/>
-      <w:spacing w:after="0" w:line="360" w:lineRule="auto"/>
-      <w:jc w:val="both"/>
+      <w:spacing w:after="0"/>
     </w:pPr>
     <w:rPr>
-      <w:rFonts w:ascii="Times New Roman" w:eastAsia="Times New Roman" w:hAnsi="Times New Roman"/>
       <w:b/>
-      <w:color w:val="000000"/>
-      <w:sz w:val="26"/>
     </w:rPr>
   </w:style>
   <w:style w:customStyle="1" w:styleId="Definition" w:type="paragraph">
     <w:name w:val="Definition"/>
     <w:basedOn w:val="Normal"/>
-    <w:pPr>
-      <w:spacing w:line="360" w:lineRule="auto"/>
-      <w:jc w:val="both"/>
-    </w:pPr>
-    <w:rPr>
-      <w:rFonts w:ascii="Times New Roman" w:eastAsia="Times New Roman" w:hAnsi="Times New Roman"/>
-      <w:color w:val="000000"/>
-      <w:sz w:val="26"/>
-    </w:rPr>
   </w:style>
   <w:style w:styleId="Caption" w:type="paragraph">
     <w:name w:val="Caption"/>
     <w:basedOn w:val="Normal"/>
     <w:link w:val="BodyTextChar"/>
     <w:pPr>
-      <w:spacing w:after="120" w:before="0" w:line="360" w:lineRule="auto"/>
-      <w:jc w:val="both"/>
+      <w:spacing w:after="120" w:before="0"/>
     </w:pPr>
     <w:rPr>
-      <w:rFonts w:ascii="Times New Roman" w:eastAsia="Times New Roman" w:hAnsi="Times New Roman"/>
       <w:i/>
-      <w:color w:val="000000"/>
-      <w:sz w:val="26"/>
     </w:rPr>
   </w:style>
   <w:style w:customStyle="1" w:styleId="TableCaption" w:type="paragraph">
@@ -2124,90 +2308,44 @@
     <w:basedOn w:val="Caption"/>
     <w:pPr>
       <w:keepNext/>
-      <w:spacing w:line="360" w:lineRule="auto"/>
-      <w:jc w:val="both"/>
     </w:pPr>
-    <w:rPr>
-      <w:rFonts w:ascii="Times New Roman" w:eastAsia="Times New Roman" w:hAnsi="Times New Roman"/>
-      <w:color w:val="000000"/>
-      <w:sz w:val="26"/>
-    </w:rPr>
   </w:style>
   <w:style w:customStyle="1" w:styleId="ImageCaption" w:type="paragraph">
     <w:name w:val="Image Caption"/>
     <w:basedOn w:val="Caption"/>
-    <w:pPr>
-      <w:spacing w:line="360" w:lineRule="auto"/>
-      <w:jc w:val="both"/>
-    </w:pPr>
-    <w:rPr>
-      <w:rFonts w:ascii="Times New Roman" w:eastAsia="Times New Roman" w:hAnsi="Times New Roman"/>
-      <w:color w:val="000000"/>
-      <w:sz w:val="26"/>
-    </w:rPr>
   </w:style>
   <w:style w:customStyle="1" w:styleId="Figure" w:type="paragraph">
     <w:name w:val="Figure"/>
     <w:basedOn w:val="Normal"/>
-    <w:pPr>
-      <w:spacing w:line="360" w:lineRule="auto"/>
-      <w:jc w:val="both"/>
-    </w:pPr>
-    <w:rPr>
-      <w:rFonts w:ascii="Times New Roman" w:eastAsia="Times New Roman" w:hAnsi="Times New Roman"/>
-      <w:color w:val="000000"/>
-      <w:sz w:val="26"/>
-    </w:rPr>
   </w:style>
   <w:style w:customStyle="1" w:styleId="CaptionedFigure" w:type="paragraph">
     <w:name w:val="Captioned Figure"/>
     <w:basedOn w:val="Figure"/>
     <w:pPr>
       <w:keepNext/>
-      <w:spacing w:line="360" w:lineRule="auto"/>
-      <w:jc w:val="both"/>
     </w:pPr>
-    <w:rPr>
-      <w:rFonts w:ascii="Times New Roman" w:eastAsia="Times New Roman" w:hAnsi="Times New Roman"/>
-      <w:color w:val="000000"/>
-      <w:sz w:val="26"/>
-    </w:rPr>
   </w:style>
   <w:style w:customStyle="1" w:styleId="BodyTextChar" w:type="character">
     <w:name w:val="Body Text Char"/>
     <w:basedOn w:val="DefaultParagraphFont"/>
     <w:link w:val="BodyText"/>
-    <w:rPr>
-      <w:rFonts w:ascii="Times New Roman" w:eastAsia="Times New Roman" w:hAnsi="Times New Roman"/>
-      <w:color w:val="000000"/>
-      <w:sz w:val="26"/>
-    </w:rPr>
   </w:style>
   <w:style w:customStyle="1" w:styleId="VerbatimChar" w:type="character">
     <w:name w:val="Verbatim Char"/>
     <w:basedOn w:val="BodyTextChar"/>
     <w:rPr>
-      <w:rFonts w:ascii="Times New Roman" w:eastAsia="Times New Roman" w:hAnsi="Times New Roman"/>
-      <w:color w:val="000000"/>
-      <w:sz w:val="26"/>
+      <w:rFonts w:ascii="Consolas" w:hAnsi="Consolas"/>
+      <w:sz w:val="22"/>
     </w:rPr>
   </w:style>
   <w:style w:customStyle="1" w:styleId="SectionNumber" w:type="character">
     <w:name w:val="Section Number"/>
     <w:basedOn w:val="BodyTextChar"/>
-    <w:rPr>
-      <w:rFonts w:ascii="Times New Roman" w:eastAsia="Times New Roman" w:hAnsi="Times New Roman"/>
-      <w:color w:val="000000"/>
-      <w:sz w:val="26"/>
-    </w:rPr>
   </w:style>
   <w:style w:styleId="FootnoteReference" w:type="character">
     <w:name w:val="Footnote Reference"/>
     <w:basedOn w:val="BodyTextChar"/>
     <w:rPr>
-      <w:rFonts w:ascii="Times New Roman" w:eastAsia="Times New Roman" w:hAnsi="Times New Roman"/>
-      <w:color w:val="000000"/>
-      <w:sz w:val="26"/>
       <w:vertAlign w:val="superscript"/>
     </w:rPr>
   </w:style>
@@ -2215,9 +2353,7 @@
     <w:name w:val="Hyperlink"/>
     <w:basedOn w:val="BodyTextChar"/>
     <w:rPr>
-      <w:rFonts w:ascii="Times New Roman" w:eastAsia="Times New Roman" w:hAnsi="Times New Roman"/>
-      <w:color w:val="000000"/>
-      <w:sz w:val="26"/>
+      <w:color w:themeColor="accent1" w:val="4F81BD"/>
     </w:rPr>
   </w:style>
   <w:style w:styleId="TOCHeading" w:type="paragraph">
@@ -2228,16 +2364,14 @@
     <w:unhideWhenUsed/>
     <w:qFormat/>
     <w:pPr>
-      <w:spacing w:before="240" w:line="360" w:lineRule="auto"/>
-      <w:jc w:val="both"/>
+      <w:spacing w:before="240" w:line="259" w:lineRule="auto"/>
       <w:outlineLvl w:val="9"/>
     </w:pPr>
     <w:rPr>
-      <w:rFonts w:ascii="Times New Roman" w:asciiTheme="majorHAnsi" w:cstheme="majorBidi" w:eastAsia="Times New Roman" w:eastAsiaTheme="majorEastAsia" w:hAnsi="Times New Roman" w:hAnsiTheme="majorHAnsi"/>
+      <w:rFonts w:asciiTheme="majorHAnsi" w:cstheme="majorBidi" w:eastAsiaTheme="majorEastAsia" w:hAnsiTheme="majorHAnsi"/>
       <w:b w:val="0"/>
       <w:bCs w:val="0"/>
-      <w:color w:val="000000"/>
-      <w:sz w:val="26"/>
+      <w:color w:themeColor="accent1" w:themeShade="BF" w:val="365F91"/>
     </w:rPr>
   </w:style>
   <w:style w:type="paragraph" w:customStyle="1" w:styleId="SourceCode">

</xml_diff>